<commit_message>
New feauture - Favourites
Added to Documentation
</commit_message>
<xml_diff>
--- a/Документация - StarHire.docx
+++ b/Документация - StarHire.docx
@@ -100,6 +100,7 @@
           <w:szCs w:val="40"/>
         </w:rPr>
       </w:pPr>
+      <w:proofErr w:type="spellStart"/>
       <w:r>
         <w:rPr>
           <w:b/>
@@ -107,7 +108,17 @@
           <w:sz w:val="40"/>
           <w:szCs w:val="40"/>
         </w:rPr>
-        <w:t>Kурсов проект</w:t>
+        <w:t>Kурсов</w:t>
+      </w:r>
+      <w:proofErr w:type="spellEnd"/>
+      <w:r>
+        <w:rPr>
+          <w:b/>
+          <w:bCs/>
+          <w:sz w:val="40"/>
+          <w:szCs w:val="40"/>
+        </w:rPr>
+        <w:t xml:space="preserve"> проект</w:t>
       </w:r>
     </w:p>
     <w:p>
@@ -127,17 +138,19 @@
           <w:sz w:val="36"/>
           <w:szCs w:val="36"/>
         </w:rPr>
-        <w:t>„</w:t>
-      </w:r>
-      <w:r>
+        <w:t>„StarHire“</w:t>
+      </w:r>
+    </w:p>
+    <w:p>
+      <w:pPr>
+        <w:jc w:val="center"/>
         <w:rPr>
           <w:b/>
           <w:bCs/>
           <w:sz w:val="36"/>
           <w:szCs w:val="36"/>
         </w:rPr>
-        <w:t>StarHire</w:t>
-      </w:r>
+      </w:pPr>
       <w:r>
         <w:rPr>
           <w:b/>
@@ -145,7 +158,7 @@
           <w:sz w:val="36"/>
           <w:szCs w:val="36"/>
         </w:rPr>
-        <w:t>“</w:t>
+        <w:t>По учебна програма „ИТ умения и кариера“</w:t>
       </w:r>
     </w:p>
     <w:p>
@@ -165,11 +178,12 @@
           <w:sz w:val="36"/>
           <w:szCs w:val="36"/>
         </w:rPr>
-        <w:t>По учебна програма „ИТ умения и кариера“</w:t>
-      </w:r>
-    </w:p>
-    <w:p>
-      <w:pPr>
+        <w:t>Модул 12. Интернет Програмиране</w:t>
+      </w:r>
+    </w:p>
+    <w:p>
+      <w:pPr>
+        <w:ind w:left="-1170" w:right="-1214"/>
         <w:jc w:val="center"/>
         <w:rPr>
           <w:b/>
@@ -185,73 +199,7 @@
           <w:sz w:val="36"/>
           <w:szCs w:val="36"/>
         </w:rPr>
-        <w:t xml:space="preserve">Модул </w:t>
-      </w:r>
-      <w:r>
-        <w:rPr>
-          <w:b/>
-          <w:bCs/>
-          <w:sz w:val="36"/>
-          <w:szCs w:val="36"/>
-        </w:rPr>
-        <w:t>12</w:t>
-      </w:r>
-      <w:r>
-        <w:rPr>
-          <w:b/>
-          <w:bCs/>
-          <w:sz w:val="36"/>
-          <w:szCs w:val="36"/>
-        </w:rPr>
-        <w:t xml:space="preserve">. </w:t>
-      </w:r>
-      <w:r>
-        <w:rPr>
-          <w:b/>
-          <w:bCs/>
-          <w:sz w:val="36"/>
-          <w:szCs w:val="36"/>
-        </w:rPr>
-        <w:t>Интернет Програмиране</w:t>
-      </w:r>
-    </w:p>
-    <w:p>
-      <w:pPr>
-        <w:ind w:left="-1170" w:right="-1214"/>
-        <w:jc w:val="center"/>
-        <w:rPr>
-          <w:b/>
-          <w:bCs/>
-          <w:sz w:val="36"/>
-          <w:szCs w:val="36"/>
-        </w:rPr>
-      </w:pPr>
-      <w:r>
-        <w:rPr>
-          <w:b/>
-          <w:bCs/>
-          <w:sz w:val="36"/>
-          <w:szCs w:val="36"/>
-        </w:rPr>
-        <w:t>н</w:t>
-      </w:r>
-      <w:r>
-        <w:rPr>
-          <w:b/>
-          <w:bCs/>
-          <w:sz w:val="36"/>
-          <w:szCs w:val="36"/>
-        </w:rPr>
-        <w:t>а Карина Поптрайкова</w:t>
-      </w:r>
-      <w:r>
-        <w:rPr>
-          <w:b/>
-          <w:bCs/>
-          <w:sz w:val="36"/>
-          <w:szCs w:val="36"/>
-        </w:rPr>
-        <w:t>, Кристина Иванова и Антония Митева</w:t>
+        <w:t>на Карина Поптрайкова, Кристина Иванова и Антония Митева</w:t>
       </w:r>
     </w:p>
     <w:p>
@@ -588,7 +536,44 @@
           <w:szCs w:val="28"/>
           <w:lang w:val="en-GB"/>
         </w:rPr>
-        <w:t>Model–View–Controller.</w:t>
+        <w:t>Model</w:t>
+      </w:r>
+      <w:r>
+        <w:rPr>
+          <w:sz w:val="28"/>
+          <w:szCs w:val="28"/>
+        </w:rPr>
+        <w:t>–</w:t>
+      </w:r>
+      <w:r>
+        <w:rPr>
+          <w:sz w:val="28"/>
+          <w:szCs w:val="28"/>
+          <w:lang w:val="en-GB"/>
+        </w:rPr>
+        <w:t>View</w:t>
+      </w:r>
+      <w:r>
+        <w:rPr>
+          <w:sz w:val="28"/>
+          <w:szCs w:val="28"/>
+        </w:rPr>
+        <w:t>–</w:t>
+      </w:r>
+      <w:r>
+        <w:rPr>
+          <w:sz w:val="28"/>
+          <w:szCs w:val="28"/>
+          <w:lang w:val="en-GB"/>
+        </w:rPr>
+        <w:t>Controller</w:t>
+      </w:r>
+      <w:r>
+        <w:rPr>
+          <w:sz w:val="28"/>
+          <w:szCs w:val="28"/>
+        </w:rPr>
+        <w:t>.</w:t>
       </w:r>
       <w:r>
         <w:rPr>
@@ -772,21 +757,7 @@
           <w:sz w:val="28"/>
           <w:szCs w:val="28"/>
         </w:rPr>
-        <w:t xml:space="preserve"> – презентационен слой, който съдържа контролерите, изгледите и логиката за обработка на потребителските заявки и визуализаци</w:t>
-      </w:r>
-      <w:r>
-        <w:rPr>
-          <w:sz w:val="28"/>
-          <w:szCs w:val="28"/>
-        </w:rPr>
-        <w:t>я</w:t>
-      </w:r>
-      <w:r>
-        <w:rPr>
-          <w:sz w:val="28"/>
-          <w:szCs w:val="28"/>
-        </w:rPr>
-        <w:t xml:space="preserve"> на информацията.</w:t>
+        <w:t xml:space="preserve"> – презентационен слой, който съдържа контролерите, изгледите и логиката за обработка на потребителските заявки и визуализация на информацията.</w:t>
       </w:r>
     </w:p>
     <w:p>
@@ -1337,7 +1308,6 @@
         <w:rPr>
           <w:sz w:val="28"/>
           <w:szCs w:val="28"/>
-          <w:lang w:val="en-US"/>
         </w:rPr>
       </w:pPr>
       <w:r>
@@ -1842,7 +1812,23 @@
           <w:sz w:val="28"/>
           <w:szCs w:val="28"/>
         </w:rPr>
-        <w:t>Администраторът се създава чрез seed механизъм. Той има най-високи права в системата и достъп до административен панел.</w:t>
+        <w:t xml:space="preserve">Администраторът се създава чрез </w:t>
+      </w:r>
+      <w:proofErr w:type="spellStart"/>
+      <w:r>
+        <w:rPr>
+          <w:sz w:val="28"/>
+          <w:szCs w:val="28"/>
+        </w:rPr>
+        <w:t>seed</w:t>
+      </w:r>
+      <w:proofErr w:type="spellEnd"/>
+      <w:r>
+        <w:rPr>
+          <w:sz w:val="28"/>
+          <w:szCs w:val="28"/>
+        </w:rPr>
+        <w:t xml:space="preserve"> механизъм. Той има най-високи права в системата и достъп до административен панел.</w:t>
       </w:r>
     </w:p>
     <w:p>
@@ -2089,7 +2075,52 @@
           <w:szCs w:val="28"/>
           <w:lang w:val="en-GB"/>
         </w:rPr>
-        <w:t>Create, Read, Update, Delete</w:t>
+        <w:t>Create</w:t>
+      </w:r>
+      <w:r>
+        <w:rPr>
+          <w:sz w:val="28"/>
+          <w:szCs w:val="28"/>
+        </w:rPr>
+        <w:t xml:space="preserve">, </w:t>
+      </w:r>
+      <w:r>
+        <w:rPr>
+          <w:sz w:val="28"/>
+          <w:szCs w:val="28"/>
+          <w:lang w:val="en-GB"/>
+        </w:rPr>
+        <w:t>Read</w:t>
+      </w:r>
+      <w:r>
+        <w:rPr>
+          <w:sz w:val="28"/>
+          <w:szCs w:val="28"/>
+        </w:rPr>
+        <w:t xml:space="preserve">, </w:t>
+      </w:r>
+      <w:r>
+        <w:rPr>
+          <w:sz w:val="28"/>
+          <w:szCs w:val="28"/>
+          <w:lang w:val="en-GB"/>
+        </w:rPr>
+        <w:t>Update</w:t>
+      </w:r>
+      <w:r>
+        <w:rPr>
+          <w:sz w:val="28"/>
+          <w:szCs w:val="28"/>
+        </w:rPr>
+        <w:t xml:space="preserve">, </w:t>
+      </w:r>
+      <w:r>
+        <w:rPr>
+          <w:sz w:val="28"/>
+          <w:szCs w:val="28"/>
+          <w:lang w:val="en-GB"/>
+        </w:rPr>
+        <w:t>Delete</w:t>
       </w:r>
       <w:r>
         <w:rPr>
@@ -2647,13 +2678,15 @@
       <w:pPr>
         <w:pStyle w:val="ListParagraph"/>
         <w:numPr>
-          <w:ilvl w:val="0"/>
+          <w:ilvl w:val="1"/>
           <w:numId w:val="20"/>
         </w:numPr>
         <w:tabs>
-          <w:tab w:val="left" w:pos="450"/>
-        </w:tabs>
-        <w:ind w:left="360"/>
+          <w:tab w:val="left" w:pos="270"/>
+          <w:tab w:val="left" w:pos="540"/>
+          <w:tab w:val="left" w:pos="720"/>
+        </w:tabs>
+        <w:ind w:left="720"/>
         <w:rPr>
           <w:b/>
           <w:bCs/>
@@ -2667,110 +2700,163 @@
           <w:bCs/>
           <w:sz w:val="28"/>
           <w:szCs w:val="28"/>
-          <w:lang w:val="en-GB"/>
-        </w:rPr>
-        <w:t>Search Engine</w:t>
-      </w:r>
-      <w:r>
-        <w:rPr>
-          <w:b/>
-          <w:bCs/>
-          <w:sz w:val="28"/>
-          <w:szCs w:val="28"/>
-        </w:rPr>
-        <w:t xml:space="preserve"> и Skills</w:t>
-      </w:r>
-    </w:p>
-    <w:p>
-      <w:pPr>
-        <w:rPr>
-          <w:sz w:val="28"/>
-          <w:szCs w:val="28"/>
-        </w:rPr>
-      </w:pPr>
-      <w:r>
-        <w:rPr>
-          <w:sz w:val="28"/>
-          <w:szCs w:val="28"/>
-        </w:rPr>
-        <w:t>Системата включва механизъм за търсене и филтриране на позиции.</w:t>
-      </w:r>
-      <w:r>
-        <w:rPr>
-          <w:sz w:val="28"/>
-          <w:szCs w:val="28"/>
-        </w:rPr>
-        <w:t xml:space="preserve"> </w:t>
-      </w:r>
-      <w:r>
-        <w:rPr>
-          <w:sz w:val="28"/>
-          <w:szCs w:val="28"/>
-        </w:rPr>
-        <w:t>Админ</w:t>
-      </w:r>
-      <w:r>
-        <w:rPr>
-          <w:sz w:val="28"/>
-          <w:szCs w:val="28"/>
-        </w:rPr>
-        <w:t>истраторът</w:t>
-      </w:r>
-      <w:r>
-        <w:rPr>
-          <w:sz w:val="28"/>
-          <w:szCs w:val="28"/>
-        </w:rPr>
-        <w:t xml:space="preserve"> може да добавя и премахва </w:t>
-      </w:r>
-      <w:r>
-        <w:rPr>
-          <w:sz w:val="28"/>
-          <w:szCs w:val="28"/>
-        </w:rPr>
-        <w:t>способности</w:t>
-      </w:r>
-      <w:r>
-        <w:rPr>
-          <w:sz w:val="28"/>
-          <w:szCs w:val="28"/>
-        </w:rPr>
-        <w:t xml:space="preserve">, а </w:t>
-      </w:r>
-      <w:r>
-        <w:rPr>
-          <w:sz w:val="28"/>
-          <w:szCs w:val="28"/>
-        </w:rPr>
-        <w:t>потребител</w:t>
-      </w:r>
-      <w:r>
-        <w:rPr>
-          <w:sz w:val="28"/>
-          <w:szCs w:val="28"/>
-        </w:rPr>
-        <w:t>ят</w:t>
-      </w:r>
-      <w:r>
-        <w:rPr>
-          <w:sz w:val="28"/>
-          <w:szCs w:val="28"/>
-        </w:rPr>
-        <w:t xml:space="preserve"> да си избера </w:t>
-      </w:r>
-      <w:r>
-        <w:rPr>
-          <w:sz w:val="28"/>
-          <w:szCs w:val="28"/>
-        </w:rPr>
-        <w:t>из</w:t>
-      </w:r>
-      <w:r>
-        <w:rPr>
-          <w:sz w:val="28"/>
-          <w:szCs w:val="28"/>
-        </w:rPr>
-        <w:t>между опциите.</w:t>
+        </w:rPr>
+        <w:t>Управление на любими обяви</w:t>
+      </w:r>
+    </w:p>
+    <w:p>
+      <w:pPr>
+        <w:tabs>
+          <w:tab w:val="left" w:pos="270"/>
+          <w:tab w:val="left" w:pos="540"/>
+          <w:tab w:val="left" w:pos="720"/>
+        </w:tabs>
+        <w:rPr>
+          <w:sz w:val="28"/>
+          <w:szCs w:val="28"/>
+        </w:rPr>
+      </w:pPr>
+      <w:r>
+        <w:rPr>
+          <w:sz w:val="28"/>
+          <w:szCs w:val="28"/>
+        </w:rPr>
+        <w:t>Системата предоставя възможност на потребители с роля „</w:t>
+      </w:r>
+      <w:r>
+        <w:rPr>
+          <w:sz w:val="28"/>
+          <w:szCs w:val="28"/>
+          <w:lang w:val="en-US"/>
+        </w:rPr>
+        <w:t>Alien</w:t>
+      </w:r>
+      <w:r>
+        <w:rPr>
+          <w:sz w:val="28"/>
+          <w:szCs w:val="28"/>
+        </w:rPr>
+        <w:t>“ да маркират обяви за работа като любими. Функционалността включва:</w:t>
+      </w:r>
+    </w:p>
+    <w:p>
+      <w:pPr>
+        <w:pStyle w:val="ListParagraph"/>
+        <w:numPr>
+          <w:ilvl w:val="0"/>
+          <w:numId w:val="45"/>
+        </w:numPr>
+        <w:tabs>
+          <w:tab w:val="left" w:pos="270"/>
+          <w:tab w:val="left" w:pos="540"/>
+          <w:tab w:val="left" w:pos="720"/>
+        </w:tabs>
+        <w:rPr>
+          <w:sz w:val="28"/>
+          <w:szCs w:val="28"/>
+        </w:rPr>
+      </w:pPr>
+      <w:r>
+        <w:rPr>
+          <w:sz w:val="28"/>
+          <w:szCs w:val="28"/>
+        </w:rPr>
+        <w:t xml:space="preserve">добавяне на обяви към списък с любими; </w:t>
+      </w:r>
+    </w:p>
+    <w:p>
+      <w:pPr>
+        <w:pStyle w:val="ListParagraph"/>
+        <w:numPr>
+          <w:ilvl w:val="0"/>
+          <w:numId w:val="45"/>
+        </w:numPr>
+        <w:tabs>
+          <w:tab w:val="left" w:pos="270"/>
+          <w:tab w:val="left" w:pos="540"/>
+          <w:tab w:val="left" w:pos="720"/>
+        </w:tabs>
+        <w:rPr>
+          <w:sz w:val="28"/>
+          <w:szCs w:val="28"/>
+        </w:rPr>
+      </w:pPr>
+      <w:r>
+        <w:rPr>
+          <w:sz w:val="28"/>
+          <w:szCs w:val="28"/>
+        </w:rPr>
+        <w:t xml:space="preserve">преглед на всички любими обяви на отделен раздел „Любими“; </w:t>
+      </w:r>
+    </w:p>
+    <w:p>
+      <w:pPr>
+        <w:pStyle w:val="ListParagraph"/>
+        <w:numPr>
+          <w:ilvl w:val="0"/>
+          <w:numId w:val="45"/>
+        </w:numPr>
+        <w:tabs>
+          <w:tab w:val="left" w:pos="270"/>
+          <w:tab w:val="left" w:pos="540"/>
+          <w:tab w:val="left" w:pos="720"/>
+        </w:tabs>
+        <w:rPr>
+          <w:sz w:val="28"/>
+          <w:szCs w:val="28"/>
+        </w:rPr>
+      </w:pPr>
+      <w:r>
+        <w:rPr>
+          <w:sz w:val="28"/>
+          <w:szCs w:val="28"/>
+        </w:rPr>
+        <w:t xml:space="preserve">лесно връщане към интересни позиции по-късно; </w:t>
+      </w:r>
+    </w:p>
+    <w:p>
+      <w:pPr>
+        <w:pStyle w:val="ListParagraph"/>
+        <w:numPr>
+          <w:ilvl w:val="0"/>
+          <w:numId w:val="45"/>
+        </w:numPr>
+        <w:tabs>
+          <w:tab w:val="left" w:pos="270"/>
+          <w:tab w:val="left" w:pos="540"/>
+          <w:tab w:val="left" w:pos="720"/>
+        </w:tabs>
+        <w:rPr>
+          <w:sz w:val="28"/>
+          <w:szCs w:val="28"/>
+        </w:rPr>
+      </w:pPr>
+      <w:r>
+        <w:rPr>
+          <w:sz w:val="28"/>
+          <w:szCs w:val="28"/>
+        </w:rPr>
+        <w:t xml:space="preserve">организиране на избора на позиции и сферата на интерес на потребителя. </w:t>
+      </w:r>
+    </w:p>
+    <w:p>
+      <w:pPr>
+        <w:tabs>
+          <w:tab w:val="left" w:pos="270"/>
+          <w:tab w:val="left" w:pos="540"/>
+          <w:tab w:val="left" w:pos="720"/>
+        </w:tabs>
+        <w:rPr>
+          <w:sz w:val="28"/>
+          <w:szCs w:val="28"/>
+        </w:rPr>
+      </w:pPr>
+      <w:r>
+        <w:rPr>
+          <w:sz w:val="28"/>
+          <w:szCs w:val="28"/>
+        </w:rPr>
+        <w:t>Тази функционалност улеснява потребителите при запазване и управление на обяви, които представляват интерес за тях, и подобрява цялостното потребителско преживяване при търсене на работа.</w:t>
       </w:r>
     </w:p>
     <w:p>
@@ -2797,6 +2883,136 @@
           <w:bCs/>
           <w:sz w:val="28"/>
           <w:szCs w:val="28"/>
+          <w:lang w:val="en-GB"/>
+        </w:rPr>
+        <w:t>Search Engine</w:t>
+      </w:r>
+      <w:r>
+        <w:rPr>
+          <w:b/>
+          <w:bCs/>
+          <w:sz w:val="28"/>
+          <w:szCs w:val="28"/>
+        </w:rPr>
+        <w:t xml:space="preserve"> и Skills</w:t>
+      </w:r>
+    </w:p>
+    <w:p>
+      <w:pPr>
+        <w:rPr>
+          <w:sz w:val="28"/>
+          <w:szCs w:val="28"/>
+        </w:rPr>
+      </w:pPr>
+      <w:r>
+        <w:rPr>
+          <w:sz w:val="28"/>
+          <w:szCs w:val="28"/>
+        </w:rPr>
+        <w:t>Системата включва механизъм за търсене и филтриране на позиции.</w:t>
+      </w:r>
+      <w:r>
+        <w:rPr>
+          <w:sz w:val="28"/>
+          <w:szCs w:val="28"/>
+        </w:rPr>
+        <w:t xml:space="preserve"> </w:t>
+      </w:r>
+      <w:r>
+        <w:rPr>
+          <w:sz w:val="28"/>
+          <w:szCs w:val="28"/>
+        </w:rPr>
+        <w:t>Админ</w:t>
+      </w:r>
+      <w:r>
+        <w:rPr>
+          <w:sz w:val="28"/>
+          <w:szCs w:val="28"/>
+        </w:rPr>
+        <w:t>истраторът</w:t>
+      </w:r>
+      <w:r>
+        <w:rPr>
+          <w:sz w:val="28"/>
+          <w:szCs w:val="28"/>
+        </w:rPr>
+        <w:t xml:space="preserve"> може да добавя и премахва </w:t>
+      </w:r>
+      <w:r>
+        <w:rPr>
+          <w:sz w:val="28"/>
+          <w:szCs w:val="28"/>
+        </w:rPr>
+        <w:t>способности</w:t>
+      </w:r>
+      <w:r>
+        <w:rPr>
+          <w:sz w:val="28"/>
+          <w:szCs w:val="28"/>
+        </w:rPr>
+        <w:t xml:space="preserve">, а </w:t>
+      </w:r>
+      <w:r>
+        <w:rPr>
+          <w:sz w:val="28"/>
+          <w:szCs w:val="28"/>
+        </w:rPr>
+        <w:t>потребител</w:t>
+      </w:r>
+      <w:r>
+        <w:rPr>
+          <w:sz w:val="28"/>
+          <w:szCs w:val="28"/>
+        </w:rPr>
+        <w:t>ят</w:t>
+      </w:r>
+      <w:r>
+        <w:rPr>
+          <w:sz w:val="28"/>
+          <w:szCs w:val="28"/>
+        </w:rPr>
+        <w:t xml:space="preserve"> да си избера </w:t>
+      </w:r>
+      <w:r>
+        <w:rPr>
+          <w:sz w:val="28"/>
+          <w:szCs w:val="28"/>
+        </w:rPr>
+        <w:t>из</w:t>
+      </w:r>
+      <w:r>
+        <w:rPr>
+          <w:sz w:val="28"/>
+          <w:szCs w:val="28"/>
+        </w:rPr>
+        <w:t>между опциите.</w:t>
+      </w:r>
+    </w:p>
+    <w:p>
+      <w:pPr>
+        <w:pStyle w:val="ListParagraph"/>
+        <w:numPr>
+          <w:ilvl w:val="0"/>
+          <w:numId w:val="20"/>
+        </w:numPr>
+        <w:tabs>
+          <w:tab w:val="left" w:pos="450"/>
+        </w:tabs>
+        <w:ind w:left="360"/>
+        <w:rPr>
+          <w:b/>
+          <w:bCs/>
+          <w:sz w:val="28"/>
+          <w:szCs w:val="28"/>
+        </w:rPr>
+      </w:pPr>
+      <w:r>
+        <w:rPr>
+          <w:b/>
+          <w:bCs/>
+          <w:sz w:val="28"/>
+          <w:szCs w:val="28"/>
         </w:rPr>
         <w:t>Unit Tests</w:t>
       </w:r>
@@ -2931,6 +3147,7 @@
           <w:sz w:val="28"/>
           <w:szCs w:val="28"/>
         </w:rPr>
+        <w:lastRenderedPageBreak/>
         <w:t>Разпределение на задачите</w:t>
       </w:r>
     </w:p>
@@ -2991,7 +3208,6 @@
           <w:sz w:val="28"/>
           <w:szCs w:val="28"/>
         </w:rPr>
-        <w:lastRenderedPageBreak/>
         <w:t>Антония Митева реализира функционалността, свързана с управлението на уменията, разработката на механизма за търсене и имплементирането на основната бизнес логика на приложението.</w:t>
       </w:r>
     </w:p>
@@ -3086,7 +3302,15 @@
           <w:sz w:val="28"/>
           <w:szCs w:val="28"/>
         </w:rPr>
-        <w:t>В бъдеще приложението може да бъде разширено с допълнителни функционалности, като например по-усъвършенствана система за филтриране и препоръки на работни позиции, внедряване на реални комуникационни механизми между работодатели и кандидати, добавяне на рейтингова система, както и интеграция с външни услуги. Възможно е също така оптимизиране на производителността и надграждане на потребителския интерфейс с по-интерактивни компоненти.</w:t>
+        <w:t xml:space="preserve">В бъдеще приложението може да бъде разширено с допълнителни функционалности, като например по-усъвършенствана система за филтриране и препоръки на работни позиции, внедряване на реални комуникационни механизми между работодатели и кандидати, </w:t>
+      </w:r>
+      <w:r>
+        <w:rPr>
+          <w:sz w:val="28"/>
+          <w:szCs w:val="28"/>
+        </w:rPr>
+        <w:lastRenderedPageBreak/>
+        <w:t>добавяне на рейтингова система, както и интеграция с външни услуги. Възможно е също така оптимизиране на производителността и надграждане на потребителския интерфейс с по-интерактивни компоненти.</w:t>
       </w:r>
     </w:p>
     <w:p>
@@ -5173,6 +5397,155 @@
     </w:lvl>
   </w:abstractNum>
   <w:abstractNum w:abstractNumId="15" w15:restartNumberingAfterBreak="0">
+    <w:nsid w:val="44B46DCF"/>
+    <w:multiLevelType w:val="multilevel"/>
+    <w:tmpl w:val="BFE06418"/>
+    <w:lvl w:ilvl="0">
+      <w:start w:val="1"/>
+      <w:numFmt w:val="bullet"/>
+      <w:lvlText w:val=""/>
+      <w:lvlJc w:val="left"/>
+      <w:pPr>
+        <w:tabs>
+          <w:tab w:val="num" w:pos="720"/>
+        </w:tabs>
+        <w:ind w:left="720" w:hanging="360"/>
+      </w:pPr>
+      <w:rPr>
+        <w:rFonts w:ascii="Symbol" w:hAnsi="Symbol" w:hint="default"/>
+        <w:sz w:val="20"/>
+      </w:rPr>
+    </w:lvl>
+    <w:lvl w:ilvl="1" w:tentative="1">
+      <w:start w:val="1"/>
+      <w:numFmt w:val="bullet"/>
+      <w:lvlText w:val="o"/>
+      <w:lvlJc w:val="left"/>
+      <w:pPr>
+        <w:tabs>
+          <w:tab w:val="num" w:pos="1440"/>
+        </w:tabs>
+        <w:ind w:left="1440" w:hanging="360"/>
+      </w:pPr>
+      <w:rPr>
+        <w:rFonts w:ascii="Courier New" w:hAnsi="Courier New" w:hint="default"/>
+        <w:sz w:val="20"/>
+      </w:rPr>
+    </w:lvl>
+    <w:lvl w:ilvl="2" w:tentative="1">
+      <w:start w:val="1"/>
+      <w:numFmt w:val="bullet"/>
+      <w:lvlText w:val=""/>
+      <w:lvlJc w:val="left"/>
+      <w:pPr>
+        <w:tabs>
+          <w:tab w:val="num" w:pos="2160"/>
+        </w:tabs>
+        <w:ind w:left="2160" w:hanging="360"/>
+      </w:pPr>
+      <w:rPr>
+        <w:rFonts w:ascii="Wingdings" w:hAnsi="Wingdings" w:hint="default"/>
+        <w:sz w:val="20"/>
+      </w:rPr>
+    </w:lvl>
+    <w:lvl w:ilvl="3" w:tentative="1">
+      <w:start w:val="1"/>
+      <w:numFmt w:val="bullet"/>
+      <w:lvlText w:val=""/>
+      <w:lvlJc w:val="left"/>
+      <w:pPr>
+        <w:tabs>
+          <w:tab w:val="num" w:pos="2880"/>
+        </w:tabs>
+        <w:ind w:left="2880" w:hanging="360"/>
+      </w:pPr>
+      <w:rPr>
+        <w:rFonts w:ascii="Wingdings" w:hAnsi="Wingdings" w:hint="default"/>
+        <w:sz w:val="20"/>
+      </w:rPr>
+    </w:lvl>
+    <w:lvl w:ilvl="4" w:tentative="1">
+      <w:start w:val="1"/>
+      <w:numFmt w:val="bullet"/>
+      <w:lvlText w:val=""/>
+      <w:lvlJc w:val="left"/>
+      <w:pPr>
+        <w:tabs>
+          <w:tab w:val="num" w:pos="3600"/>
+        </w:tabs>
+        <w:ind w:left="3600" w:hanging="360"/>
+      </w:pPr>
+      <w:rPr>
+        <w:rFonts w:ascii="Wingdings" w:hAnsi="Wingdings" w:hint="default"/>
+        <w:sz w:val="20"/>
+      </w:rPr>
+    </w:lvl>
+    <w:lvl w:ilvl="5" w:tentative="1">
+      <w:start w:val="1"/>
+      <w:numFmt w:val="bullet"/>
+      <w:lvlText w:val=""/>
+      <w:lvlJc w:val="left"/>
+      <w:pPr>
+        <w:tabs>
+          <w:tab w:val="num" w:pos="4320"/>
+        </w:tabs>
+        <w:ind w:left="4320" w:hanging="360"/>
+      </w:pPr>
+      <w:rPr>
+        <w:rFonts w:ascii="Wingdings" w:hAnsi="Wingdings" w:hint="default"/>
+        <w:sz w:val="20"/>
+      </w:rPr>
+    </w:lvl>
+    <w:lvl w:ilvl="6" w:tentative="1">
+      <w:start w:val="1"/>
+      <w:numFmt w:val="bullet"/>
+      <w:lvlText w:val=""/>
+      <w:lvlJc w:val="left"/>
+      <w:pPr>
+        <w:tabs>
+          <w:tab w:val="num" w:pos="5040"/>
+        </w:tabs>
+        <w:ind w:left="5040" w:hanging="360"/>
+      </w:pPr>
+      <w:rPr>
+        <w:rFonts w:ascii="Wingdings" w:hAnsi="Wingdings" w:hint="default"/>
+        <w:sz w:val="20"/>
+      </w:rPr>
+    </w:lvl>
+    <w:lvl w:ilvl="7" w:tentative="1">
+      <w:start w:val="1"/>
+      <w:numFmt w:val="bullet"/>
+      <w:lvlText w:val=""/>
+      <w:lvlJc w:val="left"/>
+      <w:pPr>
+        <w:tabs>
+          <w:tab w:val="num" w:pos="5760"/>
+        </w:tabs>
+        <w:ind w:left="5760" w:hanging="360"/>
+      </w:pPr>
+      <w:rPr>
+        <w:rFonts w:ascii="Wingdings" w:hAnsi="Wingdings" w:hint="default"/>
+        <w:sz w:val="20"/>
+      </w:rPr>
+    </w:lvl>
+    <w:lvl w:ilvl="8" w:tentative="1">
+      <w:start w:val="1"/>
+      <w:numFmt w:val="bullet"/>
+      <w:lvlText w:val=""/>
+      <w:lvlJc w:val="left"/>
+      <w:pPr>
+        <w:tabs>
+          <w:tab w:val="num" w:pos="6480"/>
+        </w:tabs>
+        <w:ind w:left="6480" w:hanging="360"/>
+      </w:pPr>
+      <w:rPr>
+        <w:rFonts w:ascii="Wingdings" w:hAnsi="Wingdings" w:hint="default"/>
+        <w:sz w:val="20"/>
+      </w:rPr>
+    </w:lvl>
+  </w:abstractNum>
+  <w:abstractNum w:abstractNumId="16" w15:restartNumberingAfterBreak="0">
     <w:nsid w:val="44E36930"/>
     <w:multiLevelType w:val="hybridMultilevel"/>
     <w:tmpl w:val="42366FE0"/>
@@ -5285,7 +5658,7 @@
       </w:rPr>
     </w:lvl>
   </w:abstractNum>
-  <w:abstractNum w:abstractNumId="16" w15:restartNumberingAfterBreak="0">
+  <w:abstractNum w:abstractNumId="17" w15:restartNumberingAfterBreak="0">
     <w:nsid w:val="476E7D1D"/>
     <w:multiLevelType w:val="multilevel"/>
     <w:tmpl w:val="3294CB54"/>
@@ -5434,7 +5807,7 @@
       </w:rPr>
     </w:lvl>
   </w:abstractNum>
-  <w:abstractNum w:abstractNumId="17" w15:restartNumberingAfterBreak="0">
+  <w:abstractNum w:abstractNumId="18" w15:restartNumberingAfterBreak="0">
     <w:nsid w:val="488F5D8B"/>
     <w:multiLevelType w:val="hybridMultilevel"/>
     <w:tmpl w:val="E31E9742"/>
@@ -5547,7 +5920,7 @@
       </w:rPr>
     </w:lvl>
   </w:abstractNum>
-  <w:abstractNum w:abstractNumId="18" w15:restartNumberingAfterBreak="0">
+  <w:abstractNum w:abstractNumId="19" w15:restartNumberingAfterBreak="0">
     <w:nsid w:val="4B7A516E"/>
     <w:multiLevelType w:val="multilevel"/>
     <w:tmpl w:val="58485786"/>
@@ -5696,7 +6069,7 @@
       </w:rPr>
     </w:lvl>
   </w:abstractNum>
-  <w:abstractNum w:abstractNumId="19" w15:restartNumberingAfterBreak="0">
+  <w:abstractNum w:abstractNumId="20" w15:restartNumberingAfterBreak="0">
     <w:nsid w:val="4D4518C5"/>
     <w:multiLevelType w:val="hybridMultilevel"/>
     <w:tmpl w:val="DB96AF0A"/>
@@ -5809,7 +6182,7 @@
       </w:rPr>
     </w:lvl>
   </w:abstractNum>
-  <w:abstractNum w:abstractNumId="20" w15:restartNumberingAfterBreak="0">
+  <w:abstractNum w:abstractNumId="21" w15:restartNumberingAfterBreak="0">
     <w:nsid w:val="4DDF360C"/>
     <w:multiLevelType w:val="hybridMultilevel"/>
     <w:tmpl w:val="664496FE"/>
@@ -5922,7 +6295,7 @@
       </w:rPr>
     </w:lvl>
   </w:abstractNum>
-  <w:abstractNum w:abstractNumId="21" w15:restartNumberingAfterBreak="0">
+  <w:abstractNum w:abstractNumId="22" w15:restartNumberingAfterBreak="0">
     <w:nsid w:val="4E264519"/>
     <w:multiLevelType w:val="multilevel"/>
     <w:tmpl w:val="31E22C26"/>
@@ -6071,7 +6444,7 @@
       </w:rPr>
     </w:lvl>
   </w:abstractNum>
-  <w:abstractNum w:abstractNumId="22" w15:restartNumberingAfterBreak="0">
+  <w:abstractNum w:abstractNumId="23" w15:restartNumberingAfterBreak="0">
     <w:nsid w:val="4EC75F61"/>
     <w:multiLevelType w:val="multilevel"/>
     <w:tmpl w:val="9C6E98FC"/>
@@ -6220,7 +6593,7 @@
       </w:rPr>
     </w:lvl>
   </w:abstractNum>
-  <w:abstractNum w:abstractNumId="23" w15:restartNumberingAfterBreak="0">
+  <w:abstractNum w:abstractNumId="24" w15:restartNumberingAfterBreak="0">
     <w:nsid w:val="516A15DA"/>
     <w:multiLevelType w:val="hybridMultilevel"/>
     <w:tmpl w:val="1F5A493E"/>
@@ -6333,7 +6706,7 @@
       </w:rPr>
     </w:lvl>
   </w:abstractNum>
-  <w:abstractNum w:abstractNumId="24" w15:restartNumberingAfterBreak="0">
+  <w:abstractNum w:abstractNumId="25" w15:restartNumberingAfterBreak="0">
     <w:nsid w:val="53967A40"/>
     <w:multiLevelType w:val="multilevel"/>
     <w:tmpl w:val="5F70B0B0"/>
@@ -6482,7 +6855,7 @@
       </w:rPr>
     </w:lvl>
   </w:abstractNum>
-  <w:abstractNum w:abstractNumId="25" w15:restartNumberingAfterBreak="0">
+  <w:abstractNum w:abstractNumId="26" w15:restartNumberingAfterBreak="0">
     <w:nsid w:val="54841415"/>
     <w:multiLevelType w:val="hybridMultilevel"/>
     <w:tmpl w:val="3ACC0B4A"/>
@@ -6595,7 +6968,7 @@
       </w:rPr>
     </w:lvl>
   </w:abstractNum>
-  <w:abstractNum w:abstractNumId="26" w15:restartNumberingAfterBreak="0">
+  <w:abstractNum w:abstractNumId="27" w15:restartNumberingAfterBreak="0">
     <w:nsid w:val="5CBD146D"/>
     <w:multiLevelType w:val="hybridMultilevel"/>
     <w:tmpl w:val="887A4476"/>
@@ -6708,7 +7081,7 @@
       </w:rPr>
     </w:lvl>
   </w:abstractNum>
-  <w:abstractNum w:abstractNumId="27" w15:restartNumberingAfterBreak="0">
+  <w:abstractNum w:abstractNumId="28" w15:restartNumberingAfterBreak="0">
     <w:nsid w:val="5EC5014B"/>
     <w:multiLevelType w:val="multilevel"/>
     <w:tmpl w:val="3C2017CA"/>
@@ -6829,7 +7202,7 @@
       </w:rPr>
     </w:lvl>
   </w:abstractNum>
-  <w:abstractNum w:abstractNumId="28" w15:restartNumberingAfterBreak="0">
+  <w:abstractNum w:abstractNumId="29" w15:restartNumberingAfterBreak="0">
     <w:nsid w:val="5FC85658"/>
     <w:multiLevelType w:val="multilevel"/>
     <w:tmpl w:val="78FCD36A"/>
@@ -6978,7 +7351,7 @@
       </w:rPr>
     </w:lvl>
   </w:abstractNum>
-  <w:abstractNum w:abstractNumId="29" w15:restartNumberingAfterBreak="0">
+  <w:abstractNum w:abstractNumId="30" w15:restartNumberingAfterBreak="0">
     <w:nsid w:val="636328C3"/>
     <w:multiLevelType w:val="multilevel"/>
     <w:tmpl w:val="0D12A726"/>
@@ -7127,7 +7500,7 @@
       </w:rPr>
     </w:lvl>
   </w:abstractNum>
-  <w:abstractNum w:abstractNumId="30" w15:restartNumberingAfterBreak="0">
+  <w:abstractNum w:abstractNumId="31" w15:restartNumberingAfterBreak="0">
     <w:nsid w:val="636854CF"/>
     <w:multiLevelType w:val="hybridMultilevel"/>
     <w:tmpl w:val="AABA1484"/>
@@ -7240,7 +7613,7 @@
       </w:rPr>
     </w:lvl>
   </w:abstractNum>
-  <w:abstractNum w:abstractNumId="31" w15:restartNumberingAfterBreak="0">
+  <w:abstractNum w:abstractNumId="32" w15:restartNumberingAfterBreak="0">
     <w:nsid w:val="63E22091"/>
     <w:multiLevelType w:val="hybridMultilevel"/>
     <w:tmpl w:val="35F6770C"/>
@@ -7326,7 +7699,7 @@
       </w:pPr>
     </w:lvl>
   </w:abstractNum>
-  <w:abstractNum w:abstractNumId="32" w15:restartNumberingAfterBreak="0">
+  <w:abstractNum w:abstractNumId="33" w15:restartNumberingAfterBreak="0">
     <w:nsid w:val="644037F3"/>
     <w:multiLevelType w:val="hybridMultilevel"/>
     <w:tmpl w:val="32F66A04"/>
@@ -7439,7 +7812,7 @@
       </w:rPr>
     </w:lvl>
   </w:abstractNum>
-  <w:abstractNum w:abstractNumId="33" w15:restartNumberingAfterBreak="0">
+  <w:abstractNum w:abstractNumId="34" w15:restartNumberingAfterBreak="0">
     <w:nsid w:val="64B127E5"/>
     <w:multiLevelType w:val="multilevel"/>
     <w:tmpl w:val="5358ED5C"/>
@@ -7588,7 +7961,7 @@
       </w:rPr>
     </w:lvl>
   </w:abstractNum>
-  <w:abstractNum w:abstractNumId="34" w15:restartNumberingAfterBreak="0">
+  <w:abstractNum w:abstractNumId="35" w15:restartNumberingAfterBreak="0">
     <w:nsid w:val="65681965"/>
     <w:multiLevelType w:val="hybridMultilevel"/>
     <w:tmpl w:val="31782178"/>
@@ -7701,7 +8074,7 @@
       </w:rPr>
     </w:lvl>
   </w:abstractNum>
-  <w:abstractNum w:abstractNumId="35" w15:restartNumberingAfterBreak="0">
+  <w:abstractNum w:abstractNumId="36" w15:restartNumberingAfterBreak="0">
     <w:nsid w:val="6D191CFE"/>
     <w:multiLevelType w:val="multilevel"/>
     <w:tmpl w:val="DA42AB46"/>
@@ -7850,7 +8223,7 @@
       </w:rPr>
     </w:lvl>
   </w:abstractNum>
-  <w:abstractNum w:abstractNumId="36" w15:restartNumberingAfterBreak="0">
+  <w:abstractNum w:abstractNumId="37" w15:restartNumberingAfterBreak="0">
     <w:nsid w:val="6D3F60C8"/>
     <w:multiLevelType w:val="multilevel"/>
     <w:tmpl w:val="297030E2"/>
@@ -7999,7 +8372,120 @@
       </w:rPr>
     </w:lvl>
   </w:abstractNum>
-  <w:abstractNum w:abstractNumId="37" w15:restartNumberingAfterBreak="0">
+  <w:abstractNum w:abstractNumId="38" w15:restartNumberingAfterBreak="0">
+    <w:nsid w:val="6E51794F"/>
+    <w:multiLevelType w:val="hybridMultilevel"/>
+    <w:tmpl w:val="48B223F4"/>
+    <w:lvl w:ilvl="0" w:tplc="04090001">
+      <w:start w:val="1"/>
+      <w:numFmt w:val="bullet"/>
+      <w:lvlText w:val=""/>
+      <w:lvlJc w:val="left"/>
+      <w:pPr>
+        <w:ind w:left="1080" w:hanging="360"/>
+      </w:pPr>
+      <w:rPr>
+        <w:rFonts w:ascii="Symbol" w:hAnsi="Symbol" w:hint="default"/>
+      </w:rPr>
+    </w:lvl>
+    <w:lvl w:ilvl="1" w:tplc="04090003" w:tentative="1">
+      <w:start w:val="1"/>
+      <w:numFmt w:val="bullet"/>
+      <w:lvlText w:val="o"/>
+      <w:lvlJc w:val="left"/>
+      <w:pPr>
+        <w:ind w:left="1800" w:hanging="360"/>
+      </w:pPr>
+      <w:rPr>
+        <w:rFonts w:ascii="Courier New" w:hAnsi="Courier New" w:cs="Courier New" w:hint="default"/>
+      </w:rPr>
+    </w:lvl>
+    <w:lvl w:ilvl="2" w:tplc="04090005" w:tentative="1">
+      <w:start w:val="1"/>
+      <w:numFmt w:val="bullet"/>
+      <w:lvlText w:val=""/>
+      <w:lvlJc w:val="left"/>
+      <w:pPr>
+        <w:ind w:left="2520" w:hanging="360"/>
+      </w:pPr>
+      <w:rPr>
+        <w:rFonts w:ascii="Wingdings" w:hAnsi="Wingdings" w:hint="default"/>
+      </w:rPr>
+    </w:lvl>
+    <w:lvl w:ilvl="3" w:tplc="04090001" w:tentative="1">
+      <w:start w:val="1"/>
+      <w:numFmt w:val="bullet"/>
+      <w:lvlText w:val=""/>
+      <w:lvlJc w:val="left"/>
+      <w:pPr>
+        <w:ind w:left="3240" w:hanging="360"/>
+      </w:pPr>
+      <w:rPr>
+        <w:rFonts w:ascii="Symbol" w:hAnsi="Symbol" w:hint="default"/>
+      </w:rPr>
+    </w:lvl>
+    <w:lvl w:ilvl="4" w:tplc="04090003" w:tentative="1">
+      <w:start w:val="1"/>
+      <w:numFmt w:val="bullet"/>
+      <w:lvlText w:val="o"/>
+      <w:lvlJc w:val="left"/>
+      <w:pPr>
+        <w:ind w:left="3960" w:hanging="360"/>
+      </w:pPr>
+      <w:rPr>
+        <w:rFonts w:ascii="Courier New" w:hAnsi="Courier New" w:cs="Courier New" w:hint="default"/>
+      </w:rPr>
+    </w:lvl>
+    <w:lvl w:ilvl="5" w:tplc="04090005" w:tentative="1">
+      <w:start w:val="1"/>
+      <w:numFmt w:val="bullet"/>
+      <w:lvlText w:val=""/>
+      <w:lvlJc w:val="left"/>
+      <w:pPr>
+        <w:ind w:left="4680" w:hanging="360"/>
+      </w:pPr>
+      <w:rPr>
+        <w:rFonts w:ascii="Wingdings" w:hAnsi="Wingdings" w:hint="default"/>
+      </w:rPr>
+    </w:lvl>
+    <w:lvl w:ilvl="6" w:tplc="04090001" w:tentative="1">
+      <w:start w:val="1"/>
+      <w:numFmt w:val="bullet"/>
+      <w:lvlText w:val=""/>
+      <w:lvlJc w:val="left"/>
+      <w:pPr>
+        <w:ind w:left="5400" w:hanging="360"/>
+      </w:pPr>
+      <w:rPr>
+        <w:rFonts w:ascii="Symbol" w:hAnsi="Symbol" w:hint="default"/>
+      </w:rPr>
+    </w:lvl>
+    <w:lvl w:ilvl="7" w:tplc="04090003" w:tentative="1">
+      <w:start w:val="1"/>
+      <w:numFmt w:val="bullet"/>
+      <w:lvlText w:val="o"/>
+      <w:lvlJc w:val="left"/>
+      <w:pPr>
+        <w:ind w:left="6120" w:hanging="360"/>
+      </w:pPr>
+      <w:rPr>
+        <w:rFonts w:ascii="Courier New" w:hAnsi="Courier New" w:cs="Courier New" w:hint="default"/>
+      </w:rPr>
+    </w:lvl>
+    <w:lvl w:ilvl="8" w:tplc="04090005" w:tentative="1">
+      <w:start w:val="1"/>
+      <w:numFmt w:val="bullet"/>
+      <w:lvlText w:val=""/>
+      <w:lvlJc w:val="left"/>
+      <w:pPr>
+        <w:ind w:left="6840" w:hanging="360"/>
+      </w:pPr>
+      <w:rPr>
+        <w:rFonts w:ascii="Wingdings" w:hAnsi="Wingdings" w:hint="default"/>
+      </w:rPr>
+    </w:lvl>
+  </w:abstractNum>
+  <w:abstractNum w:abstractNumId="39" w15:restartNumberingAfterBreak="0">
     <w:nsid w:val="74036E35"/>
     <w:multiLevelType w:val="multilevel"/>
     <w:tmpl w:val="3C2017CA"/>
@@ -8120,7 +8606,7 @@
       </w:rPr>
     </w:lvl>
   </w:abstractNum>
-  <w:abstractNum w:abstractNumId="38" w15:restartNumberingAfterBreak="0">
+  <w:abstractNum w:abstractNumId="40" w15:restartNumberingAfterBreak="0">
     <w:nsid w:val="781C1CC8"/>
     <w:multiLevelType w:val="multilevel"/>
     <w:tmpl w:val="D96E0438"/>
@@ -8269,7 +8755,7 @@
       </w:rPr>
     </w:lvl>
   </w:abstractNum>
-  <w:abstractNum w:abstractNumId="39" w15:restartNumberingAfterBreak="0">
+  <w:abstractNum w:abstractNumId="41" w15:restartNumberingAfterBreak="0">
     <w:nsid w:val="7B1A5F39"/>
     <w:multiLevelType w:val="multilevel"/>
     <w:tmpl w:val="920A1BDC"/>
@@ -8418,7 +8904,7 @@
       </w:rPr>
     </w:lvl>
   </w:abstractNum>
-  <w:abstractNum w:abstractNumId="40" w15:restartNumberingAfterBreak="0">
+  <w:abstractNum w:abstractNumId="42" w15:restartNumberingAfterBreak="0">
     <w:nsid w:val="7C786291"/>
     <w:multiLevelType w:val="hybridMultilevel"/>
     <w:tmpl w:val="58702332"/>
@@ -8531,7 +9017,7 @@
       </w:rPr>
     </w:lvl>
   </w:abstractNum>
-  <w:abstractNum w:abstractNumId="41" w15:restartNumberingAfterBreak="0">
+  <w:abstractNum w:abstractNumId="43" w15:restartNumberingAfterBreak="0">
     <w:nsid w:val="7E777573"/>
     <w:multiLevelType w:val="multilevel"/>
     <w:tmpl w:val="1AD48A6A"/>
@@ -8680,7 +9166,7 @@
       </w:rPr>
     </w:lvl>
   </w:abstractNum>
-  <w:abstractNum w:abstractNumId="42" w15:restartNumberingAfterBreak="0">
+  <w:abstractNum w:abstractNumId="44" w15:restartNumberingAfterBreak="0">
     <w:nsid w:val="7FC15CC1"/>
     <w:multiLevelType w:val="multilevel"/>
     <w:tmpl w:val="662E7EDC"/>
@@ -8830,13 +9316,13 @@
     </w:lvl>
   </w:abstractNum>
   <w:num w:numId="1" w16cid:durableId="687029830">
-    <w:abstractNumId w:val="38"/>
+    <w:abstractNumId w:val="40"/>
   </w:num>
   <w:num w:numId="2" w16cid:durableId="1131634850">
     <w:abstractNumId w:val="12"/>
   </w:num>
   <w:num w:numId="3" w16cid:durableId="164978741">
-    <w:abstractNumId w:val="39"/>
+    <w:abstractNumId w:val="41"/>
   </w:num>
   <w:num w:numId="4" w16cid:durableId="509217595">
     <w:abstractNumId w:val="8"/>
@@ -8848,19 +9334,19 @@
     <w:abstractNumId w:val="13"/>
   </w:num>
   <w:num w:numId="7" w16cid:durableId="66417887">
-    <w:abstractNumId w:val="18"/>
+    <w:abstractNumId w:val="19"/>
   </w:num>
   <w:num w:numId="8" w16cid:durableId="1925872850">
-    <w:abstractNumId w:val="24"/>
+    <w:abstractNumId w:val="25"/>
   </w:num>
   <w:num w:numId="9" w16cid:durableId="1987198686">
-    <w:abstractNumId w:val="29"/>
+    <w:abstractNumId w:val="30"/>
   </w:num>
   <w:num w:numId="10" w16cid:durableId="313146714">
     <w:abstractNumId w:val="5"/>
   </w:num>
   <w:num w:numId="11" w16cid:durableId="147214141">
-    <w:abstractNumId w:val="28"/>
+    <w:abstractNumId w:val="29"/>
   </w:num>
   <w:num w:numId="12" w16cid:durableId="1837840385">
     <w:abstractNumId w:val="7"/>
@@ -8869,10 +9355,10 @@
     <w:abstractNumId w:val="14"/>
   </w:num>
   <w:num w:numId="14" w16cid:durableId="1984118269">
-    <w:abstractNumId w:val="16"/>
+    <w:abstractNumId w:val="17"/>
   </w:num>
   <w:num w:numId="15" w16cid:durableId="1217010866">
-    <w:abstractNumId w:val="22"/>
+    <w:abstractNumId w:val="23"/>
   </w:num>
   <w:num w:numId="16" w16cid:durableId="131405398">
     <w:abstractNumId w:val="3"/>
@@ -8881,19 +9367,19 @@
     <w:abstractNumId w:val="6"/>
   </w:num>
   <w:num w:numId="18" w16cid:durableId="561644815">
-    <w:abstractNumId w:val="35"/>
+    <w:abstractNumId w:val="36"/>
   </w:num>
   <w:num w:numId="19" w16cid:durableId="847258880">
     <w:abstractNumId w:val="10"/>
   </w:num>
   <w:num w:numId="20" w16cid:durableId="1438982566">
-    <w:abstractNumId w:val="37"/>
+    <w:abstractNumId w:val="39"/>
   </w:num>
   <w:num w:numId="21" w16cid:durableId="1910574829">
-    <w:abstractNumId w:val="27"/>
+    <w:abstractNumId w:val="28"/>
   </w:num>
   <w:num w:numId="22" w16cid:durableId="2019916740">
-    <w:abstractNumId w:val="31"/>
+    <w:abstractNumId w:val="32"/>
   </w:num>
   <w:num w:numId="23" w16cid:durableId="912665574">
     <w:abstractNumId w:val="9"/>
@@ -8902,61 +9388,67 @@
     <w:abstractNumId w:val="2"/>
   </w:num>
   <w:num w:numId="25" w16cid:durableId="243994820">
-    <w:abstractNumId w:val="30"/>
+    <w:abstractNumId w:val="31"/>
   </w:num>
   <w:num w:numId="26" w16cid:durableId="1153525775">
-    <w:abstractNumId w:val="17"/>
+    <w:abstractNumId w:val="18"/>
   </w:num>
   <w:num w:numId="27" w16cid:durableId="1485663380">
     <w:abstractNumId w:val="11"/>
   </w:num>
   <w:num w:numId="28" w16cid:durableId="2107529258">
-    <w:abstractNumId w:val="40"/>
+    <w:abstractNumId w:val="42"/>
   </w:num>
   <w:num w:numId="29" w16cid:durableId="2049530657">
-    <w:abstractNumId w:val="25"/>
+    <w:abstractNumId w:val="26"/>
   </w:num>
   <w:num w:numId="30" w16cid:durableId="1735007342">
+    <w:abstractNumId w:val="35"/>
+  </w:num>
+  <w:num w:numId="31" w16cid:durableId="2107924255">
+    <w:abstractNumId w:val="22"/>
+  </w:num>
+  <w:num w:numId="32" w16cid:durableId="1425688182">
+    <w:abstractNumId w:val="37"/>
+  </w:num>
+  <w:num w:numId="33" w16cid:durableId="1139345044">
     <w:abstractNumId w:val="34"/>
   </w:num>
-  <w:num w:numId="31" w16cid:durableId="2107924255">
-    <w:abstractNumId w:val="21"/>
-  </w:num>
-  <w:num w:numId="32" w16cid:durableId="1425688182">
-    <w:abstractNumId w:val="36"/>
-  </w:num>
-  <w:num w:numId="33" w16cid:durableId="1139345044">
-    <w:abstractNumId w:val="33"/>
-  </w:num>
   <w:num w:numId="34" w16cid:durableId="1457136281">
-    <w:abstractNumId w:val="41"/>
+    <w:abstractNumId w:val="43"/>
   </w:num>
   <w:num w:numId="35" w16cid:durableId="551963292">
-    <w:abstractNumId w:val="42"/>
+    <w:abstractNumId w:val="44"/>
   </w:num>
   <w:num w:numId="36" w16cid:durableId="657223796">
-    <w:abstractNumId w:val="26"/>
+    <w:abstractNumId w:val="27"/>
   </w:num>
   <w:num w:numId="37" w16cid:durableId="2075201036">
     <w:abstractNumId w:val="0"/>
   </w:num>
   <w:num w:numId="38" w16cid:durableId="166022137">
-    <w:abstractNumId w:val="15"/>
+    <w:abstractNumId w:val="16"/>
   </w:num>
   <w:num w:numId="39" w16cid:durableId="286543120">
     <w:abstractNumId w:val="4"/>
   </w:num>
   <w:num w:numId="40" w16cid:durableId="1378047871">
-    <w:abstractNumId w:val="32"/>
+    <w:abstractNumId w:val="33"/>
   </w:num>
   <w:num w:numId="41" w16cid:durableId="1437671300">
-    <w:abstractNumId w:val="23"/>
+    <w:abstractNumId w:val="24"/>
   </w:num>
   <w:num w:numId="42" w16cid:durableId="1116826372">
+    <w:abstractNumId w:val="21"/>
+  </w:num>
+  <w:num w:numId="43" w16cid:durableId="720523140">
     <w:abstractNumId w:val="20"/>
   </w:num>
-  <w:num w:numId="43" w16cid:durableId="720523140">
-    <w:abstractNumId w:val="19"/>
+  <w:num w:numId="44" w16cid:durableId="571433099">
+    <w:abstractNumId w:val="15"/>
+  </w:num>
+  <w:num w:numId="45" w16cid:durableId="1833593909">
+    <w:abstractNumId w:val="38"/>
   </w:num>
 </w:numbering>
 </file>

</xml_diff>

<commit_message>
Update documentation with recommended jobs feature
</commit_message>
<xml_diff>
--- a/Документация - StarHire.docx
+++ b/Документация - StarHire.docx
@@ -2847,8 +2847,11 @@
           <w:tab w:val="left" w:pos="720"/>
         </w:tabs>
         <w:rPr>
-          <w:sz w:val="28"/>
-          <w:szCs w:val="28"/>
+          <w:b/>
+          <w:bCs/>
+          <w:sz w:val="28"/>
+          <w:szCs w:val="28"/>
+          <w:lang w:val="en-GB"/>
         </w:rPr>
       </w:pPr>
       <w:r>
@@ -2858,6 +2861,217 @@
         </w:rPr>
         <w:t>Тази функционалност улеснява потребителите при запазване и управление на обяви, които представляват интерес за тях, и подобрява цялостното потребителско преживяване при търсене на работа.</w:t>
       </w:r>
+    </w:p>
+    <w:p>
+      <w:pPr>
+        <w:pStyle w:val="ListParagraph"/>
+        <w:numPr>
+          <w:ilvl w:val="1"/>
+          <w:numId w:val="20"/>
+        </w:numPr>
+        <w:tabs>
+          <w:tab w:val="left" w:pos="270"/>
+          <w:tab w:val="left" w:pos="540"/>
+          <w:tab w:val="left" w:pos="720"/>
+        </w:tabs>
+        <w:ind w:left="720"/>
+        <w:rPr>
+          <w:b/>
+          <w:bCs/>
+          <w:sz w:val="28"/>
+          <w:szCs w:val="28"/>
+        </w:rPr>
+      </w:pPr>
+      <w:r>
+        <w:rPr>
+          <w:b/>
+          <w:bCs/>
+          <w:sz w:val="28"/>
+          <w:szCs w:val="28"/>
+        </w:rPr>
+        <w:t>Препоръчани работни места според умения</w:t>
+      </w:r>
+    </w:p>
+    <w:p>
+      <w:pPr>
+        <w:tabs>
+          <w:tab w:val="left" w:pos="270"/>
+          <w:tab w:val="left" w:pos="540"/>
+          <w:tab w:val="left" w:pos="720"/>
+        </w:tabs>
+        <w:rPr>
+          <w:sz w:val="28"/>
+          <w:szCs w:val="28"/>
+        </w:rPr>
+      </w:pPr>
+      <w:r>
+        <w:rPr>
+          <w:sz w:val="28"/>
+          <w:szCs w:val="28"/>
+        </w:rPr>
+        <w:t>Системата предоставя интелигентна функционалност за препоръчване на работни позиции въз основа на уменията на потребителя. Всеки потребител в платформата притежава определен набор от умения, а всяка обява за работа изисква конкретни умения.</w:t>
+      </w:r>
+    </w:p>
+    <w:p>
+      <w:pPr>
+        <w:tabs>
+          <w:tab w:val="left" w:pos="270"/>
+          <w:tab w:val="left" w:pos="540"/>
+          <w:tab w:val="left" w:pos="720"/>
+        </w:tabs>
+        <w:rPr>
+          <w:sz w:val="28"/>
+          <w:szCs w:val="28"/>
+        </w:rPr>
+      </w:pPr>
+      <w:r>
+        <w:rPr>
+          <w:sz w:val="28"/>
+          <w:szCs w:val="28"/>
+        </w:rPr>
+        <w:t>Функционалността включва:</w:t>
+      </w:r>
+    </w:p>
+    <w:p>
+      <w:pPr>
+        <w:pStyle w:val="ListParagraph"/>
+        <w:numPr>
+          <w:ilvl w:val="0"/>
+          <w:numId w:val="46"/>
+        </w:numPr>
+        <w:tabs>
+          <w:tab w:val="left" w:pos="270"/>
+          <w:tab w:val="left" w:pos="540"/>
+          <w:tab w:val="left" w:pos="720"/>
+        </w:tabs>
+        <w:rPr>
+          <w:sz w:val="28"/>
+          <w:szCs w:val="28"/>
+        </w:rPr>
+      </w:pPr>
+      <w:r>
+        <w:rPr>
+          <w:sz w:val="28"/>
+          <w:szCs w:val="28"/>
+        </w:rPr>
+        <w:t>анализ на въведените от потребителя умения;</w:t>
+      </w:r>
+    </w:p>
+    <w:p>
+      <w:pPr>
+        <w:pStyle w:val="ListParagraph"/>
+        <w:numPr>
+          <w:ilvl w:val="0"/>
+          <w:numId w:val="46"/>
+        </w:numPr>
+        <w:tabs>
+          <w:tab w:val="left" w:pos="270"/>
+          <w:tab w:val="left" w:pos="540"/>
+          <w:tab w:val="left" w:pos="720"/>
+        </w:tabs>
+        <w:rPr>
+          <w:sz w:val="28"/>
+          <w:szCs w:val="28"/>
+        </w:rPr>
+      </w:pPr>
+      <w:r>
+        <w:rPr>
+          <w:sz w:val="28"/>
+          <w:szCs w:val="28"/>
+        </w:rPr>
+        <w:t>съпоставяне на уменията с изискванията на обявите;</w:t>
+      </w:r>
+    </w:p>
+    <w:p>
+      <w:pPr>
+        <w:pStyle w:val="ListParagraph"/>
+        <w:numPr>
+          <w:ilvl w:val="0"/>
+          <w:numId w:val="46"/>
+        </w:numPr>
+        <w:tabs>
+          <w:tab w:val="left" w:pos="270"/>
+          <w:tab w:val="left" w:pos="540"/>
+          <w:tab w:val="left" w:pos="720"/>
+        </w:tabs>
+        <w:rPr>
+          <w:sz w:val="28"/>
+          <w:szCs w:val="28"/>
+        </w:rPr>
+      </w:pPr>
+      <w:r>
+        <w:rPr>
+          <w:sz w:val="28"/>
+          <w:szCs w:val="28"/>
+        </w:rPr>
+        <w:t>визуализиране на списък с препоръчани работни места;</w:t>
+      </w:r>
+    </w:p>
+    <w:p>
+      <w:pPr>
+        <w:pStyle w:val="ListParagraph"/>
+        <w:numPr>
+          <w:ilvl w:val="0"/>
+          <w:numId w:val="46"/>
+        </w:numPr>
+        <w:tabs>
+          <w:tab w:val="left" w:pos="270"/>
+          <w:tab w:val="left" w:pos="540"/>
+          <w:tab w:val="left" w:pos="720"/>
+        </w:tabs>
+        <w:rPr>
+          <w:sz w:val="28"/>
+          <w:szCs w:val="28"/>
+        </w:rPr>
+      </w:pPr>
+      <w:r>
+        <w:rPr>
+          <w:sz w:val="28"/>
+          <w:szCs w:val="28"/>
+        </w:rPr>
+        <w:t>улесняване на процеса по избор на подходяща позиция.</w:t>
+      </w:r>
+    </w:p>
+    <w:p>
+      <w:pPr>
+        <w:tabs>
+          <w:tab w:val="left" w:pos="270"/>
+          <w:tab w:val="left" w:pos="540"/>
+          <w:tab w:val="left" w:pos="720"/>
+        </w:tabs>
+        <w:rPr>
+          <w:sz w:val="28"/>
+          <w:szCs w:val="28"/>
+        </w:rPr>
+      </w:pPr>
+      <w:r>
+        <w:rPr>
+          <w:sz w:val="28"/>
+          <w:szCs w:val="28"/>
+        </w:rPr>
+        <w:t xml:space="preserve">Тази функционалност значително подобрява потребителското преживяване, като автоматично насочва потребителите към </w:t>
+      </w:r>
+      <w:r>
+        <w:rPr>
+          <w:sz w:val="28"/>
+          <w:szCs w:val="28"/>
+        </w:rPr>
+        <w:lastRenderedPageBreak/>
+        <w:t>позиции, за които имат най-голяма вероятност да бъдат одобрени, и им помага да кандидатстват по-ефективно.</w:t>
+      </w:r>
+    </w:p>
+    <w:p>
+      <w:pPr>
+        <w:tabs>
+          <w:tab w:val="left" w:pos="270"/>
+          <w:tab w:val="left" w:pos="540"/>
+          <w:tab w:val="left" w:pos="720"/>
+        </w:tabs>
+        <w:rPr>
+          <w:sz w:val="28"/>
+          <w:szCs w:val="28"/>
+        </w:rPr>
+      </w:pPr>
     </w:p>
     <w:p>
       <w:pPr>
@@ -2894,14 +3108,26 @@
           <w:sz w:val="28"/>
           <w:szCs w:val="28"/>
         </w:rPr>
-        <w:t xml:space="preserve"> и Skills</w:t>
-      </w:r>
-    </w:p>
-    <w:p>
-      <w:pPr>
-        <w:rPr>
-          <w:sz w:val="28"/>
-          <w:szCs w:val="28"/>
+        <w:t xml:space="preserve"> и </w:t>
+      </w:r>
+      <w:proofErr w:type="spellStart"/>
+      <w:r>
+        <w:rPr>
+          <w:b/>
+          <w:bCs/>
+          <w:sz w:val="28"/>
+          <w:szCs w:val="28"/>
+        </w:rPr>
+        <w:t>Skills</w:t>
+      </w:r>
+      <w:proofErr w:type="spellEnd"/>
+    </w:p>
+    <w:p>
+      <w:pPr>
+        <w:rPr>
+          <w:sz w:val="28"/>
+          <w:szCs w:val="28"/>
+          <w:lang w:val="en-GB"/>
         </w:rPr>
       </w:pPr>
       <w:r>
@@ -3007,6 +3233,7 @@
           <w:szCs w:val="28"/>
         </w:rPr>
       </w:pPr>
+      <w:proofErr w:type="spellStart"/>
       <w:r>
         <w:rPr>
           <w:b/>
@@ -3014,8 +3241,29 @@
           <w:sz w:val="28"/>
           <w:szCs w:val="28"/>
         </w:rPr>
-        <w:t>Unit Tests</w:t>
-      </w:r>
+        <w:t>Unit</w:t>
+      </w:r>
+      <w:proofErr w:type="spellEnd"/>
+      <w:r>
+        <w:rPr>
+          <w:b/>
+          <w:bCs/>
+          <w:sz w:val="28"/>
+          <w:szCs w:val="28"/>
+        </w:rPr>
+        <w:t xml:space="preserve"> </w:t>
+      </w:r>
+      <w:proofErr w:type="spellStart"/>
+      <w:r>
+        <w:rPr>
+          <w:b/>
+          <w:bCs/>
+          <w:sz w:val="28"/>
+          <w:szCs w:val="28"/>
+        </w:rPr>
+        <w:t>Tests</w:t>
+      </w:r>
+      <w:proofErr w:type="spellEnd"/>
     </w:p>
     <w:p>
       <w:pPr>
@@ -3147,67 +3395,67 @@
           <w:sz w:val="28"/>
           <w:szCs w:val="28"/>
         </w:rPr>
+        <w:t>Разпределение на задачите</w:t>
+      </w:r>
+    </w:p>
+    <w:p>
+      <w:pPr>
+        <w:rPr>
+          <w:sz w:val="28"/>
+          <w:szCs w:val="28"/>
+        </w:rPr>
+      </w:pPr>
+      <w:r>
+        <w:rPr>
+          <w:sz w:val="28"/>
+          <w:szCs w:val="28"/>
+        </w:rPr>
+        <w:t>Разработката на проекта е осъществена чрез разпределение на конкретни отговорности между членовете на екипа, като всеки участник поема ясно определена част от функционалността и реализацията.</w:t>
+      </w:r>
+    </w:p>
+    <w:p>
+      <w:pPr>
+        <w:rPr>
+          <w:sz w:val="28"/>
+          <w:szCs w:val="28"/>
+        </w:rPr>
+      </w:pPr>
+      <w:r>
+        <w:rPr>
+          <w:sz w:val="28"/>
+          <w:szCs w:val="28"/>
+        </w:rPr>
+        <w:t>Карина Поптрайкова отговаря за реализирането на системата за роли и автентикация, разработката на контролерите, изготвянето на документацията и подготовката на презентацията на проекта.</w:t>
+      </w:r>
+    </w:p>
+    <w:p>
+      <w:pPr>
+        <w:rPr>
+          <w:sz w:val="28"/>
+          <w:szCs w:val="28"/>
+        </w:rPr>
+      </w:pPr>
+      <w:r>
+        <w:rPr>
+          <w:sz w:val="28"/>
+          <w:szCs w:val="28"/>
+        </w:rPr>
+        <w:t>Кристина Иванова е ангажирана с изграждането на потребителския интерфейс, създаването и конфигурирането на базата данни, разработването на модулните тестове, дефинирането на моделите и изграждането на административните и потребителските панели.</w:t>
+      </w:r>
+    </w:p>
+    <w:p>
+      <w:pPr>
+        <w:rPr>
+          <w:sz w:val="28"/>
+          <w:szCs w:val="28"/>
+        </w:rPr>
+      </w:pPr>
+      <w:r>
+        <w:rPr>
+          <w:sz w:val="28"/>
+          <w:szCs w:val="28"/>
+        </w:rPr>
         <w:lastRenderedPageBreak/>
-        <w:t>Разпределение на задачите</w:t>
-      </w:r>
-    </w:p>
-    <w:p>
-      <w:pPr>
-        <w:rPr>
-          <w:sz w:val="28"/>
-          <w:szCs w:val="28"/>
-        </w:rPr>
-      </w:pPr>
-      <w:r>
-        <w:rPr>
-          <w:sz w:val="28"/>
-          <w:szCs w:val="28"/>
-        </w:rPr>
-        <w:t>Разработката на проекта е осъществена чрез разпределение на конкретни отговорности между членовете на екипа, като всеки участник поема ясно определена част от функционалността и реализацията.</w:t>
-      </w:r>
-    </w:p>
-    <w:p>
-      <w:pPr>
-        <w:rPr>
-          <w:sz w:val="28"/>
-          <w:szCs w:val="28"/>
-        </w:rPr>
-      </w:pPr>
-      <w:r>
-        <w:rPr>
-          <w:sz w:val="28"/>
-          <w:szCs w:val="28"/>
-        </w:rPr>
-        <w:t>Карина Поптрайкова отговаря за реализирането на системата за роли и автентикация, разработката на контролерите, изготвянето на документацията и подготовката на презентацията на проекта.</w:t>
-      </w:r>
-    </w:p>
-    <w:p>
-      <w:pPr>
-        <w:rPr>
-          <w:sz w:val="28"/>
-          <w:szCs w:val="28"/>
-        </w:rPr>
-      </w:pPr>
-      <w:r>
-        <w:rPr>
-          <w:sz w:val="28"/>
-          <w:szCs w:val="28"/>
-        </w:rPr>
-        <w:t>Кристина Иванова е ангажирана с изграждането на потребителския интерфейс, създаването и конфигурирането на базата данни, разработването на модулните тестове, дефинирането на моделите и изграждането на административните и потребителските панели.</w:t>
-      </w:r>
-    </w:p>
-    <w:p>
-      <w:pPr>
-        <w:rPr>
-          <w:sz w:val="28"/>
-          <w:szCs w:val="28"/>
-        </w:rPr>
-      </w:pPr>
-      <w:r>
-        <w:rPr>
-          <w:sz w:val="28"/>
-          <w:szCs w:val="28"/>
-        </w:rPr>
         <w:t>Антония Митева реализира функционалността, свързана с управлението на уменията, разработката на механизма за търсене и имплементирането на основната бизнес логика на приложението.</w:t>
       </w:r>
     </w:p>
@@ -3302,15 +3550,7 @@
           <w:sz w:val="28"/>
           <w:szCs w:val="28"/>
         </w:rPr>
-        <w:t xml:space="preserve">В бъдеще приложението може да бъде разширено с допълнителни функционалности, като например по-усъвършенствана система за филтриране и препоръки на работни позиции, внедряване на реални комуникационни механизми между работодатели и кандидати, </w:t>
-      </w:r>
-      <w:r>
-        <w:rPr>
-          <w:sz w:val="28"/>
-          <w:szCs w:val="28"/>
-        </w:rPr>
-        <w:lastRenderedPageBreak/>
-        <w:t>добавяне на рейтингова система, както и интеграция с външни услуги. Възможно е също така оптимизиране на производителността и надграждане на потребителския интерфейс с по-интерактивни компоненти.</w:t>
+        <w:t>В бъдеще приложението може да бъде разширено с допълнителни функционалности, като например по-усъвършенствана система за филтриране и препоръки на работни позиции, внедряване на реални комуникационни механизми между работодатели и кандидати, добавяне на рейтингова система, както и интеграция с външни услуги. Възможно е също така оптимизиране на производителността и надграждане на потребителския интерфейс с по-интерактивни компоненти.</w:t>
       </w:r>
     </w:p>
     <w:p>
@@ -4751,6 +4991,119 @@
     </w:lvl>
   </w:abstractNum>
   <w:abstractNum w:abstractNumId="10" w15:restartNumberingAfterBreak="0">
+    <w:nsid w:val="26ED03B9"/>
+    <w:multiLevelType w:val="hybridMultilevel"/>
+    <w:tmpl w:val="13C82F48"/>
+    <w:lvl w:ilvl="0" w:tplc="08090001">
+      <w:start w:val="1"/>
+      <w:numFmt w:val="bullet"/>
+      <w:lvlText w:val=""/>
+      <w:lvlJc w:val="left"/>
+      <w:pPr>
+        <w:ind w:left="720" w:hanging="360"/>
+      </w:pPr>
+      <w:rPr>
+        <w:rFonts w:ascii="Symbol" w:hAnsi="Symbol" w:hint="default"/>
+      </w:rPr>
+    </w:lvl>
+    <w:lvl w:ilvl="1" w:tplc="08090003" w:tentative="1">
+      <w:start w:val="1"/>
+      <w:numFmt w:val="bullet"/>
+      <w:lvlText w:val="o"/>
+      <w:lvlJc w:val="left"/>
+      <w:pPr>
+        <w:ind w:left="1440" w:hanging="360"/>
+      </w:pPr>
+      <w:rPr>
+        <w:rFonts w:ascii="Courier New" w:hAnsi="Courier New" w:cs="Courier New" w:hint="default"/>
+      </w:rPr>
+    </w:lvl>
+    <w:lvl w:ilvl="2" w:tplc="08090005" w:tentative="1">
+      <w:start w:val="1"/>
+      <w:numFmt w:val="bullet"/>
+      <w:lvlText w:val=""/>
+      <w:lvlJc w:val="left"/>
+      <w:pPr>
+        <w:ind w:left="2160" w:hanging="360"/>
+      </w:pPr>
+      <w:rPr>
+        <w:rFonts w:ascii="Wingdings" w:hAnsi="Wingdings" w:hint="default"/>
+      </w:rPr>
+    </w:lvl>
+    <w:lvl w:ilvl="3" w:tplc="08090001" w:tentative="1">
+      <w:start w:val="1"/>
+      <w:numFmt w:val="bullet"/>
+      <w:lvlText w:val=""/>
+      <w:lvlJc w:val="left"/>
+      <w:pPr>
+        <w:ind w:left="2880" w:hanging="360"/>
+      </w:pPr>
+      <w:rPr>
+        <w:rFonts w:ascii="Symbol" w:hAnsi="Symbol" w:hint="default"/>
+      </w:rPr>
+    </w:lvl>
+    <w:lvl w:ilvl="4" w:tplc="08090003" w:tentative="1">
+      <w:start w:val="1"/>
+      <w:numFmt w:val="bullet"/>
+      <w:lvlText w:val="o"/>
+      <w:lvlJc w:val="left"/>
+      <w:pPr>
+        <w:ind w:left="3600" w:hanging="360"/>
+      </w:pPr>
+      <w:rPr>
+        <w:rFonts w:ascii="Courier New" w:hAnsi="Courier New" w:cs="Courier New" w:hint="default"/>
+      </w:rPr>
+    </w:lvl>
+    <w:lvl w:ilvl="5" w:tplc="08090005" w:tentative="1">
+      <w:start w:val="1"/>
+      <w:numFmt w:val="bullet"/>
+      <w:lvlText w:val=""/>
+      <w:lvlJc w:val="left"/>
+      <w:pPr>
+        <w:ind w:left="4320" w:hanging="360"/>
+      </w:pPr>
+      <w:rPr>
+        <w:rFonts w:ascii="Wingdings" w:hAnsi="Wingdings" w:hint="default"/>
+      </w:rPr>
+    </w:lvl>
+    <w:lvl w:ilvl="6" w:tplc="08090001" w:tentative="1">
+      <w:start w:val="1"/>
+      <w:numFmt w:val="bullet"/>
+      <w:lvlText w:val=""/>
+      <w:lvlJc w:val="left"/>
+      <w:pPr>
+        <w:ind w:left="5040" w:hanging="360"/>
+      </w:pPr>
+      <w:rPr>
+        <w:rFonts w:ascii="Symbol" w:hAnsi="Symbol" w:hint="default"/>
+      </w:rPr>
+    </w:lvl>
+    <w:lvl w:ilvl="7" w:tplc="08090003" w:tentative="1">
+      <w:start w:val="1"/>
+      <w:numFmt w:val="bullet"/>
+      <w:lvlText w:val="o"/>
+      <w:lvlJc w:val="left"/>
+      <w:pPr>
+        <w:ind w:left="5760" w:hanging="360"/>
+      </w:pPr>
+      <w:rPr>
+        <w:rFonts w:ascii="Courier New" w:hAnsi="Courier New" w:cs="Courier New" w:hint="default"/>
+      </w:rPr>
+    </w:lvl>
+    <w:lvl w:ilvl="8" w:tplc="08090005" w:tentative="1">
+      <w:start w:val="1"/>
+      <w:numFmt w:val="bullet"/>
+      <w:lvlText w:val=""/>
+      <w:lvlJc w:val="left"/>
+      <w:pPr>
+        <w:ind w:left="6480" w:hanging="360"/>
+      </w:pPr>
+      <w:rPr>
+        <w:rFonts w:ascii="Wingdings" w:hAnsi="Wingdings" w:hint="default"/>
+      </w:rPr>
+    </w:lvl>
+  </w:abstractNum>
+  <w:abstractNum w:abstractNumId="11" w15:restartNumberingAfterBreak="0">
     <w:nsid w:val="2A467760"/>
     <w:multiLevelType w:val="hybridMultilevel"/>
     <w:tmpl w:val="D494F436"/>
@@ -4836,7 +5189,7 @@
       </w:pPr>
     </w:lvl>
   </w:abstractNum>
-  <w:abstractNum w:abstractNumId="11" w15:restartNumberingAfterBreak="0">
+  <w:abstractNum w:abstractNumId="12" w15:restartNumberingAfterBreak="0">
     <w:nsid w:val="36FF10A0"/>
     <w:multiLevelType w:val="hybridMultilevel"/>
     <w:tmpl w:val="F9F6F7A6"/>
@@ -4949,7 +5302,7 @@
       </w:rPr>
     </w:lvl>
   </w:abstractNum>
-  <w:abstractNum w:abstractNumId="12" w15:restartNumberingAfterBreak="0">
+  <w:abstractNum w:abstractNumId="13" w15:restartNumberingAfterBreak="0">
     <w:nsid w:val="38124A39"/>
     <w:multiLevelType w:val="multilevel"/>
     <w:tmpl w:val="504A982E"/>
@@ -5098,7 +5451,7 @@
       </w:rPr>
     </w:lvl>
   </w:abstractNum>
-  <w:abstractNum w:abstractNumId="13" w15:restartNumberingAfterBreak="0">
+  <w:abstractNum w:abstractNumId="14" w15:restartNumberingAfterBreak="0">
     <w:nsid w:val="3EA74234"/>
     <w:multiLevelType w:val="multilevel"/>
     <w:tmpl w:val="2E0E5C5A"/>
@@ -5247,7 +5600,7 @@
       </w:rPr>
     </w:lvl>
   </w:abstractNum>
-  <w:abstractNum w:abstractNumId="14" w15:restartNumberingAfterBreak="0">
+  <w:abstractNum w:abstractNumId="15" w15:restartNumberingAfterBreak="0">
     <w:nsid w:val="3F822A75"/>
     <w:multiLevelType w:val="multilevel"/>
     <w:tmpl w:val="F0FECB1C"/>
@@ -5396,7 +5749,7 @@
       </w:rPr>
     </w:lvl>
   </w:abstractNum>
-  <w:abstractNum w:abstractNumId="15" w15:restartNumberingAfterBreak="0">
+  <w:abstractNum w:abstractNumId="16" w15:restartNumberingAfterBreak="0">
     <w:nsid w:val="44B46DCF"/>
     <w:multiLevelType w:val="multilevel"/>
     <w:tmpl w:val="BFE06418"/>
@@ -5545,7 +5898,7 @@
       </w:rPr>
     </w:lvl>
   </w:abstractNum>
-  <w:abstractNum w:abstractNumId="16" w15:restartNumberingAfterBreak="0">
+  <w:abstractNum w:abstractNumId="17" w15:restartNumberingAfterBreak="0">
     <w:nsid w:val="44E36930"/>
     <w:multiLevelType w:val="hybridMultilevel"/>
     <w:tmpl w:val="42366FE0"/>
@@ -5658,7 +6011,7 @@
       </w:rPr>
     </w:lvl>
   </w:abstractNum>
-  <w:abstractNum w:abstractNumId="17" w15:restartNumberingAfterBreak="0">
+  <w:abstractNum w:abstractNumId="18" w15:restartNumberingAfterBreak="0">
     <w:nsid w:val="476E7D1D"/>
     <w:multiLevelType w:val="multilevel"/>
     <w:tmpl w:val="3294CB54"/>
@@ -5807,7 +6160,7 @@
       </w:rPr>
     </w:lvl>
   </w:abstractNum>
-  <w:abstractNum w:abstractNumId="18" w15:restartNumberingAfterBreak="0">
+  <w:abstractNum w:abstractNumId="19" w15:restartNumberingAfterBreak="0">
     <w:nsid w:val="488F5D8B"/>
     <w:multiLevelType w:val="hybridMultilevel"/>
     <w:tmpl w:val="E31E9742"/>
@@ -5920,7 +6273,7 @@
       </w:rPr>
     </w:lvl>
   </w:abstractNum>
-  <w:abstractNum w:abstractNumId="19" w15:restartNumberingAfterBreak="0">
+  <w:abstractNum w:abstractNumId="20" w15:restartNumberingAfterBreak="0">
     <w:nsid w:val="4B7A516E"/>
     <w:multiLevelType w:val="multilevel"/>
     <w:tmpl w:val="58485786"/>
@@ -6069,7 +6422,7 @@
       </w:rPr>
     </w:lvl>
   </w:abstractNum>
-  <w:abstractNum w:abstractNumId="20" w15:restartNumberingAfterBreak="0">
+  <w:abstractNum w:abstractNumId="21" w15:restartNumberingAfterBreak="0">
     <w:nsid w:val="4D4518C5"/>
     <w:multiLevelType w:val="hybridMultilevel"/>
     <w:tmpl w:val="DB96AF0A"/>
@@ -6182,7 +6535,7 @@
       </w:rPr>
     </w:lvl>
   </w:abstractNum>
-  <w:abstractNum w:abstractNumId="21" w15:restartNumberingAfterBreak="0">
+  <w:abstractNum w:abstractNumId="22" w15:restartNumberingAfterBreak="0">
     <w:nsid w:val="4DDF360C"/>
     <w:multiLevelType w:val="hybridMultilevel"/>
     <w:tmpl w:val="664496FE"/>
@@ -6295,7 +6648,7 @@
       </w:rPr>
     </w:lvl>
   </w:abstractNum>
-  <w:abstractNum w:abstractNumId="22" w15:restartNumberingAfterBreak="0">
+  <w:abstractNum w:abstractNumId="23" w15:restartNumberingAfterBreak="0">
     <w:nsid w:val="4E264519"/>
     <w:multiLevelType w:val="multilevel"/>
     <w:tmpl w:val="31E22C26"/>
@@ -6444,7 +6797,7 @@
       </w:rPr>
     </w:lvl>
   </w:abstractNum>
-  <w:abstractNum w:abstractNumId="23" w15:restartNumberingAfterBreak="0">
+  <w:abstractNum w:abstractNumId="24" w15:restartNumberingAfterBreak="0">
     <w:nsid w:val="4EC75F61"/>
     <w:multiLevelType w:val="multilevel"/>
     <w:tmpl w:val="9C6E98FC"/>
@@ -6593,7 +6946,7 @@
       </w:rPr>
     </w:lvl>
   </w:abstractNum>
-  <w:abstractNum w:abstractNumId="24" w15:restartNumberingAfterBreak="0">
+  <w:abstractNum w:abstractNumId="25" w15:restartNumberingAfterBreak="0">
     <w:nsid w:val="516A15DA"/>
     <w:multiLevelType w:val="hybridMultilevel"/>
     <w:tmpl w:val="1F5A493E"/>
@@ -6706,7 +7059,7 @@
       </w:rPr>
     </w:lvl>
   </w:abstractNum>
-  <w:abstractNum w:abstractNumId="25" w15:restartNumberingAfterBreak="0">
+  <w:abstractNum w:abstractNumId="26" w15:restartNumberingAfterBreak="0">
     <w:nsid w:val="53967A40"/>
     <w:multiLevelType w:val="multilevel"/>
     <w:tmpl w:val="5F70B0B0"/>
@@ -6855,7 +7208,7 @@
       </w:rPr>
     </w:lvl>
   </w:abstractNum>
-  <w:abstractNum w:abstractNumId="26" w15:restartNumberingAfterBreak="0">
+  <w:abstractNum w:abstractNumId="27" w15:restartNumberingAfterBreak="0">
     <w:nsid w:val="54841415"/>
     <w:multiLevelType w:val="hybridMultilevel"/>
     <w:tmpl w:val="3ACC0B4A"/>
@@ -6968,7 +7321,7 @@
       </w:rPr>
     </w:lvl>
   </w:abstractNum>
-  <w:abstractNum w:abstractNumId="27" w15:restartNumberingAfterBreak="0">
+  <w:abstractNum w:abstractNumId="28" w15:restartNumberingAfterBreak="0">
     <w:nsid w:val="5CBD146D"/>
     <w:multiLevelType w:val="hybridMultilevel"/>
     <w:tmpl w:val="887A4476"/>
@@ -7081,7 +7434,7 @@
       </w:rPr>
     </w:lvl>
   </w:abstractNum>
-  <w:abstractNum w:abstractNumId="28" w15:restartNumberingAfterBreak="0">
+  <w:abstractNum w:abstractNumId="29" w15:restartNumberingAfterBreak="0">
     <w:nsid w:val="5EC5014B"/>
     <w:multiLevelType w:val="multilevel"/>
     <w:tmpl w:val="3C2017CA"/>
@@ -7202,7 +7555,7 @@
       </w:rPr>
     </w:lvl>
   </w:abstractNum>
-  <w:abstractNum w:abstractNumId="29" w15:restartNumberingAfterBreak="0">
+  <w:abstractNum w:abstractNumId="30" w15:restartNumberingAfterBreak="0">
     <w:nsid w:val="5FC85658"/>
     <w:multiLevelType w:val="multilevel"/>
     <w:tmpl w:val="78FCD36A"/>
@@ -7351,7 +7704,7 @@
       </w:rPr>
     </w:lvl>
   </w:abstractNum>
-  <w:abstractNum w:abstractNumId="30" w15:restartNumberingAfterBreak="0">
+  <w:abstractNum w:abstractNumId="31" w15:restartNumberingAfterBreak="0">
     <w:nsid w:val="636328C3"/>
     <w:multiLevelType w:val="multilevel"/>
     <w:tmpl w:val="0D12A726"/>
@@ -7500,7 +7853,7 @@
       </w:rPr>
     </w:lvl>
   </w:abstractNum>
-  <w:abstractNum w:abstractNumId="31" w15:restartNumberingAfterBreak="0">
+  <w:abstractNum w:abstractNumId="32" w15:restartNumberingAfterBreak="0">
     <w:nsid w:val="636854CF"/>
     <w:multiLevelType w:val="hybridMultilevel"/>
     <w:tmpl w:val="AABA1484"/>
@@ -7613,7 +7966,7 @@
       </w:rPr>
     </w:lvl>
   </w:abstractNum>
-  <w:abstractNum w:abstractNumId="32" w15:restartNumberingAfterBreak="0">
+  <w:abstractNum w:abstractNumId="33" w15:restartNumberingAfterBreak="0">
     <w:nsid w:val="63E22091"/>
     <w:multiLevelType w:val="hybridMultilevel"/>
     <w:tmpl w:val="35F6770C"/>
@@ -7699,7 +8052,7 @@
       </w:pPr>
     </w:lvl>
   </w:abstractNum>
-  <w:abstractNum w:abstractNumId="33" w15:restartNumberingAfterBreak="0">
+  <w:abstractNum w:abstractNumId="34" w15:restartNumberingAfterBreak="0">
     <w:nsid w:val="644037F3"/>
     <w:multiLevelType w:val="hybridMultilevel"/>
     <w:tmpl w:val="32F66A04"/>
@@ -7812,7 +8165,7 @@
       </w:rPr>
     </w:lvl>
   </w:abstractNum>
-  <w:abstractNum w:abstractNumId="34" w15:restartNumberingAfterBreak="0">
+  <w:abstractNum w:abstractNumId="35" w15:restartNumberingAfterBreak="0">
     <w:nsid w:val="64B127E5"/>
     <w:multiLevelType w:val="multilevel"/>
     <w:tmpl w:val="5358ED5C"/>
@@ -7961,7 +8314,7 @@
       </w:rPr>
     </w:lvl>
   </w:abstractNum>
-  <w:abstractNum w:abstractNumId="35" w15:restartNumberingAfterBreak="0">
+  <w:abstractNum w:abstractNumId="36" w15:restartNumberingAfterBreak="0">
     <w:nsid w:val="65681965"/>
     <w:multiLevelType w:val="hybridMultilevel"/>
     <w:tmpl w:val="31782178"/>
@@ -8074,7 +8427,7 @@
       </w:rPr>
     </w:lvl>
   </w:abstractNum>
-  <w:abstractNum w:abstractNumId="36" w15:restartNumberingAfterBreak="0">
+  <w:abstractNum w:abstractNumId="37" w15:restartNumberingAfterBreak="0">
     <w:nsid w:val="6D191CFE"/>
     <w:multiLevelType w:val="multilevel"/>
     <w:tmpl w:val="DA42AB46"/>
@@ -8223,7 +8576,7 @@
       </w:rPr>
     </w:lvl>
   </w:abstractNum>
-  <w:abstractNum w:abstractNumId="37" w15:restartNumberingAfterBreak="0">
+  <w:abstractNum w:abstractNumId="38" w15:restartNumberingAfterBreak="0">
     <w:nsid w:val="6D3F60C8"/>
     <w:multiLevelType w:val="multilevel"/>
     <w:tmpl w:val="297030E2"/>
@@ -8372,7 +8725,7 @@
       </w:rPr>
     </w:lvl>
   </w:abstractNum>
-  <w:abstractNum w:abstractNumId="38" w15:restartNumberingAfterBreak="0">
+  <w:abstractNum w:abstractNumId="39" w15:restartNumberingAfterBreak="0">
     <w:nsid w:val="6E51794F"/>
     <w:multiLevelType w:val="hybridMultilevel"/>
     <w:tmpl w:val="48B223F4"/>
@@ -8485,7 +8838,7 @@
       </w:rPr>
     </w:lvl>
   </w:abstractNum>
-  <w:abstractNum w:abstractNumId="39" w15:restartNumberingAfterBreak="0">
+  <w:abstractNum w:abstractNumId="40" w15:restartNumberingAfterBreak="0">
     <w:nsid w:val="74036E35"/>
     <w:multiLevelType w:val="multilevel"/>
     <w:tmpl w:val="3C2017CA"/>
@@ -8606,7 +8959,7 @@
       </w:rPr>
     </w:lvl>
   </w:abstractNum>
-  <w:abstractNum w:abstractNumId="40" w15:restartNumberingAfterBreak="0">
+  <w:abstractNum w:abstractNumId="41" w15:restartNumberingAfterBreak="0">
     <w:nsid w:val="781C1CC8"/>
     <w:multiLevelType w:val="multilevel"/>
     <w:tmpl w:val="D96E0438"/>
@@ -8755,7 +9108,7 @@
       </w:rPr>
     </w:lvl>
   </w:abstractNum>
-  <w:abstractNum w:abstractNumId="41" w15:restartNumberingAfterBreak="0">
+  <w:abstractNum w:abstractNumId="42" w15:restartNumberingAfterBreak="0">
     <w:nsid w:val="7B1A5F39"/>
     <w:multiLevelType w:val="multilevel"/>
     <w:tmpl w:val="920A1BDC"/>
@@ -8904,7 +9257,7 @@
       </w:rPr>
     </w:lvl>
   </w:abstractNum>
-  <w:abstractNum w:abstractNumId="42" w15:restartNumberingAfterBreak="0">
+  <w:abstractNum w:abstractNumId="43" w15:restartNumberingAfterBreak="0">
     <w:nsid w:val="7C786291"/>
     <w:multiLevelType w:val="hybridMultilevel"/>
     <w:tmpl w:val="58702332"/>
@@ -9017,7 +9370,7 @@
       </w:rPr>
     </w:lvl>
   </w:abstractNum>
-  <w:abstractNum w:abstractNumId="43" w15:restartNumberingAfterBreak="0">
+  <w:abstractNum w:abstractNumId="44" w15:restartNumberingAfterBreak="0">
     <w:nsid w:val="7E777573"/>
     <w:multiLevelType w:val="multilevel"/>
     <w:tmpl w:val="1AD48A6A"/>
@@ -9166,7 +9519,7 @@
       </w:rPr>
     </w:lvl>
   </w:abstractNum>
-  <w:abstractNum w:abstractNumId="44" w15:restartNumberingAfterBreak="0">
+  <w:abstractNum w:abstractNumId="45" w15:restartNumberingAfterBreak="0">
     <w:nsid w:val="7FC15CC1"/>
     <w:multiLevelType w:val="multilevel"/>
     <w:tmpl w:val="662E7EDC"/>
@@ -9316,13 +9669,13 @@
     </w:lvl>
   </w:abstractNum>
   <w:num w:numId="1" w16cid:durableId="687029830">
-    <w:abstractNumId w:val="40"/>
+    <w:abstractNumId w:val="41"/>
   </w:num>
   <w:num w:numId="2" w16cid:durableId="1131634850">
-    <w:abstractNumId w:val="12"/>
+    <w:abstractNumId w:val="13"/>
   </w:num>
   <w:num w:numId="3" w16cid:durableId="164978741">
-    <w:abstractNumId w:val="41"/>
+    <w:abstractNumId w:val="42"/>
   </w:num>
   <w:num w:numId="4" w16cid:durableId="509217595">
     <w:abstractNumId w:val="8"/>
@@ -9331,34 +9684,34 @@
     <w:abstractNumId w:val="1"/>
   </w:num>
   <w:num w:numId="6" w16cid:durableId="606544886">
-    <w:abstractNumId w:val="13"/>
+    <w:abstractNumId w:val="14"/>
   </w:num>
   <w:num w:numId="7" w16cid:durableId="66417887">
-    <w:abstractNumId w:val="19"/>
+    <w:abstractNumId w:val="20"/>
   </w:num>
   <w:num w:numId="8" w16cid:durableId="1925872850">
-    <w:abstractNumId w:val="25"/>
+    <w:abstractNumId w:val="26"/>
   </w:num>
   <w:num w:numId="9" w16cid:durableId="1987198686">
-    <w:abstractNumId w:val="30"/>
+    <w:abstractNumId w:val="31"/>
   </w:num>
   <w:num w:numId="10" w16cid:durableId="313146714">
     <w:abstractNumId w:val="5"/>
   </w:num>
   <w:num w:numId="11" w16cid:durableId="147214141">
-    <w:abstractNumId w:val="29"/>
+    <w:abstractNumId w:val="30"/>
   </w:num>
   <w:num w:numId="12" w16cid:durableId="1837840385">
     <w:abstractNumId w:val="7"/>
   </w:num>
   <w:num w:numId="13" w16cid:durableId="1040784944">
-    <w:abstractNumId w:val="14"/>
+    <w:abstractNumId w:val="15"/>
   </w:num>
   <w:num w:numId="14" w16cid:durableId="1984118269">
-    <w:abstractNumId w:val="17"/>
+    <w:abstractNumId w:val="18"/>
   </w:num>
   <w:num w:numId="15" w16cid:durableId="1217010866">
-    <w:abstractNumId w:val="23"/>
+    <w:abstractNumId w:val="24"/>
   </w:num>
   <w:num w:numId="16" w16cid:durableId="131405398">
     <w:abstractNumId w:val="3"/>
@@ -9367,19 +9720,19 @@
     <w:abstractNumId w:val="6"/>
   </w:num>
   <w:num w:numId="18" w16cid:durableId="561644815">
-    <w:abstractNumId w:val="36"/>
+    <w:abstractNumId w:val="37"/>
   </w:num>
   <w:num w:numId="19" w16cid:durableId="847258880">
-    <w:abstractNumId w:val="10"/>
+    <w:abstractNumId w:val="11"/>
   </w:num>
   <w:num w:numId="20" w16cid:durableId="1438982566">
-    <w:abstractNumId w:val="39"/>
+    <w:abstractNumId w:val="40"/>
   </w:num>
   <w:num w:numId="21" w16cid:durableId="1910574829">
-    <w:abstractNumId w:val="28"/>
+    <w:abstractNumId w:val="29"/>
   </w:num>
   <w:num w:numId="22" w16cid:durableId="2019916740">
-    <w:abstractNumId w:val="32"/>
+    <w:abstractNumId w:val="33"/>
   </w:num>
   <w:num w:numId="23" w16cid:durableId="912665574">
     <w:abstractNumId w:val="9"/>
@@ -9388,67 +9741,70 @@
     <w:abstractNumId w:val="2"/>
   </w:num>
   <w:num w:numId="25" w16cid:durableId="243994820">
-    <w:abstractNumId w:val="31"/>
+    <w:abstractNumId w:val="32"/>
   </w:num>
   <w:num w:numId="26" w16cid:durableId="1153525775">
-    <w:abstractNumId w:val="18"/>
+    <w:abstractNumId w:val="19"/>
   </w:num>
   <w:num w:numId="27" w16cid:durableId="1485663380">
-    <w:abstractNumId w:val="11"/>
+    <w:abstractNumId w:val="12"/>
   </w:num>
   <w:num w:numId="28" w16cid:durableId="2107529258">
-    <w:abstractNumId w:val="42"/>
+    <w:abstractNumId w:val="43"/>
   </w:num>
   <w:num w:numId="29" w16cid:durableId="2049530657">
-    <w:abstractNumId w:val="26"/>
+    <w:abstractNumId w:val="27"/>
   </w:num>
   <w:num w:numId="30" w16cid:durableId="1735007342">
+    <w:abstractNumId w:val="36"/>
+  </w:num>
+  <w:num w:numId="31" w16cid:durableId="2107924255">
+    <w:abstractNumId w:val="23"/>
+  </w:num>
+  <w:num w:numId="32" w16cid:durableId="1425688182">
+    <w:abstractNumId w:val="38"/>
+  </w:num>
+  <w:num w:numId="33" w16cid:durableId="1139345044">
     <w:abstractNumId w:val="35"/>
   </w:num>
-  <w:num w:numId="31" w16cid:durableId="2107924255">
-    <w:abstractNumId w:val="22"/>
-  </w:num>
-  <w:num w:numId="32" w16cid:durableId="1425688182">
-    <w:abstractNumId w:val="37"/>
-  </w:num>
-  <w:num w:numId="33" w16cid:durableId="1139345044">
-    <w:abstractNumId w:val="34"/>
-  </w:num>
   <w:num w:numId="34" w16cid:durableId="1457136281">
-    <w:abstractNumId w:val="43"/>
+    <w:abstractNumId w:val="44"/>
   </w:num>
   <w:num w:numId="35" w16cid:durableId="551963292">
-    <w:abstractNumId w:val="44"/>
+    <w:abstractNumId w:val="45"/>
   </w:num>
   <w:num w:numId="36" w16cid:durableId="657223796">
-    <w:abstractNumId w:val="27"/>
+    <w:abstractNumId w:val="28"/>
   </w:num>
   <w:num w:numId="37" w16cid:durableId="2075201036">
     <w:abstractNumId w:val="0"/>
   </w:num>
   <w:num w:numId="38" w16cid:durableId="166022137">
-    <w:abstractNumId w:val="16"/>
+    <w:abstractNumId w:val="17"/>
   </w:num>
   <w:num w:numId="39" w16cid:durableId="286543120">
     <w:abstractNumId w:val="4"/>
   </w:num>
   <w:num w:numId="40" w16cid:durableId="1378047871">
-    <w:abstractNumId w:val="33"/>
+    <w:abstractNumId w:val="34"/>
   </w:num>
   <w:num w:numId="41" w16cid:durableId="1437671300">
-    <w:abstractNumId w:val="24"/>
+    <w:abstractNumId w:val="25"/>
   </w:num>
   <w:num w:numId="42" w16cid:durableId="1116826372">
+    <w:abstractNumId w:val="22"/>
+  </w:num>
+  <w:num w:numId="43" w16cid:durableId="720523140">
     <w:abstractNumId w:val="21"/>
   </w:num>
-  <w:num w:numId="43" w16cid:durableId="720523140">
-    <w:abstractNumId w:val="20"/>
-  </w:num>
   <w:num w:numId="44" w16cid:durableId="571433099">
-    <w:abstractNumId w:val="15"/>
+    <w:abstractNumId w:val="16"/>
   </w:num>
   <w:num w:numId="45" w16cid:durableId="1833593909">
-    <w:abstractNumId w:val="38"/>
+    <w:abstractNumId w:val="39"/>
+  </w:num>
+  <w:num w:numId="46" w16cid:durableId="533806615">
+    <w:abstractNumId w:val="10"/>
   </w:num>
 </w:numbering>
 </file>
@@ -10065,6 +10421,7 @@
   <w:style w:type="character" w:default="1" w:styleId="DefaultParagraphFont">
     <w:name w:val="Default Paragraph Font"/>
     <w:uiPriority w:val="1"/>
+    <w:semiHidden/>
     <w:unhideWhenUsed/>
   </w:style>
   <w:style w:type="table" w:default="1" w:styleId="TableNormal">

</xml_diff>

<commit_message>
Update documentation and presentation
</commit_message>
<xml_diff>
--- a/Документация - StarHire.docx
+++ b/Документация - StarHire.docx
@@ -2630,7 +2630,28 @@
           <w:szCs w:val="28"/>
         </w:rPr>
         <w:lastRenderedPageBreak/>
-        <w:t>определяне по заплата;</w:t>
+        <w:t>определяне по заплата</w:t>
+      </w:r>
+      <w:r>
+        <w:rPr>
+          <w:sz w:val="28"/>
+          <w:szCs w:val="28"/>
+        </w:rPr>
+        <w:t xml:space="preserve"> – </w:t>
+      </w:r>
+      <w:r>
+        <w:rPr>
+          <w:sz w:val="28"/>
+          <w:szCs w:val="28"/>
+        </w:rPr>
+        <w:t>минимална и/или максимална</w:t>
+      </w:r>
+      <w:r>
+        <w:rPr>
+          <w:sz w:val="28"/>
+          <w:szCs w:val="28"/>
+        </w:rPr>
+        <w:t>;</w:t>
       </w:r>
     </w:p>
     <w:p>
@@ -2851,7 +2872,6 @@
           <w:bCs/>
           <w:sz w:val="28"/>
           <w:szCs w:val="28"/>
-          <w:lang w:val="en-GB"/>
         </w:rPr>
       </w:pPr>
       <w:r>
@@ -3108,26 +3128,14 @@
           <w:sz w:val="28"/>
           <w:szCs w:val="28"/>
         </w:rPr>
-        <w:t xml:space="preserve"> и </w:t>
-      </w:r>
-      <w:proofErr w:type="spellStart"/>
-      <w:r>
-        <w:rPr>
-          <w:b/>
-          <w:bCs/>
-          <w:sz w:val="28"/>
-          <w:szCs w:val="28"/>
-        </w:rPr>
-        <w:t>Skills</w:t>
-      </w:r>
-      <w:proofErr w:type="spellEnd"/>
-    </w:p>
-    <w:p>
-      <w:pPr>
-        <w:rPr>
-          <w:sz w:val="28"/>
-          <w:szCs w:val="28"/>
-          <w:lang w:val="en-GB"/>
+        <w:t xml:space="preserve"> и Skills</w:t>
+      </w:r>
+    </w:p>
+    <w:p>
+      <w:pPr>
+        <w:rPr>
+          <w:sz w:val="28"/>
+          <w:szCs w:val="28"/>
         </w:rPr>
       </w:pPr>
       <w:r>
@@ -3233,7 +3241,6 @@
           <w:szCs w:val="28"/>
         </w:rPr>
       </w:pPr>
-      <w:proofErr w:type="spellStart"/>
       <w:r>
         <w:rPr>
           <w:b/>
@@ -3241,29 +3248,8 @@
           <w:sz w:val="28"/>
           <w:szCs w:val="28"/>
         </w:rPr>
-        <w:t>Unit</w:t>
-      </w:r>
-      <w:proofErr w:type="spellEnd"/>
-      <w:r>
-        <w:rPr>
-          <w:b/>
-          <w:bCs/>
-          <w:sz w:val="28"/>
-          <w:szCs w:val="28"/>
-        </w:rPr>
-        <w:t xml:space="preserve"> </w:t>
-      </w:r>
-      <w:proofErr w:type="spellStart"/>
-      <w:r>
-        <w:rPr>
-          <w:b/>
-          <w:bCs/>
-          <w:sz w:val="28"/>
-          <w:szCs w:val="28"/>
-        </w:rPr>
-        <w:t>Tests</w:t>
-      </w:r>
-      <w:proofErr w:type="spellEnd"/>
+        <w:t>Unit Tests</w:t>
+      </w:r>
     </w:p>
     <w:p>
       <w:pPr>

</xml_diff>